<commit_message>
Minor: update form modal (last LHA)
</commit_message>
<xml_diff>
--- a/docs/ISO_27001/advanced_security/Advanced_Security_Operations_Checklist.docx
+++ b/docs/ISO_27001/advanced_security/Advanced_Security_Operations_Checklist.docx
@@ -4021,17 +4021,8 @@
             <w:vAlign w:val="center"/>
           </w:tcPr>
           <w:p>
-            <w:pPr>
-              <w:jc w:val="center"/>
-            </w:pPr>
-            <w:r/>
-            <w:r>
-              <w:rPr>
-                <w:rFonts w:ascii="Calibri" w:hAnsi="Calibri"/>
-                <w:b w:val="0"/>
-                <w:color w:val="333333"/>
-                <w:sz w:val="19"/>
-              </w:rPr>
+            <w:r>
+              <w:t>OFI</w:t>
             </w:r>
           </w:p>
         </w:tc>
@@ -4053,17 +4044,8 @@
             <w:vAlign w:val="center"/>
           </w:tcPr>
           <w:p>
-            <w:pPr>
-              <w:jc w:val="left"/>
-            </w:pPr>
-            <w:r/>
-            <w:r>
-              <w:rPr>
-                <w:rFonts w:ascii="Calibri" w:hAnsi="Calibri"/>
-                <w:b w:val="0"/>
-                <w:color w:val="333333"/>
-                <w:sz w:val="19"/>
-              </w:rPr>
+            <w:r>
+              <w:t>Kebijakan Vulnerability Disclosure Policy (VDP) telah dirumuskan dalam dokumen BBP-001 Section 3; publikasi resmi di portal publik sedang dalam tahap finalisasi.</w:t>
             </w:r>
           </w:p>
         </w:tc>
@@ -4188,17 +4170,8 @@
             <w:vAlign w:val="center"/>
           </w:tcPr>
           <w:p>
-            <w:pPr>
-              <w:jc w:val="center"/>
-            </w:pPr>
-            <w:r/>
-            <w:r>
-              <w:rPr>
-                <w:rFonts w:ascii="Calibri" w:hAnsi="Calibri"/>
-                <w:b w:val="0"/>
-                <w:color w:val="333333"/>
-                <w:sz w:val="19"/>
-              </w:rPr>
+            <w:r>
+              <w:t>NC</w:t>
             </w:r>
           </w:p>
         </w:tc>
@@ -4220,17 +4193,8 @@
             <w:vAlign w:val="center"/>
           </w:tcPr>
           <w:p>
-            <w:pPr>
-              <w:jc w:val="left"/>
-            </w:pPr>
-            <w:r/>
-            <w:r>
-              <w:rPr>
-                <w:rFonts w:ascii="Calibri" w:hAnsi="Calibri"/>
-                <w:b w:val="0"/>
-                <w:color w:val="333333"/>
-                <w:sz w:val="19"/>
-              </w:rPr>
+            <w:r>
+              <w:t>Portal bug bounty publik pihak ketiga (HackerOne/Bugcrowd) belum terintegrasi; saat ini pelaporan kerentanan eksternal diarahkan via email security@auditsphere.app (NC-01).</w:t>
             </w:r>
           </w:p>
         </w:tc>
@@ -4355,17 +4319,8 @@
             <w:vAlign w:val="center"/>
           </w:tcPr>
           <w:p>
-            <w:pPr>
-              <w:jc w:val="center"/>
-            </w:pPr>
-            <w:r/>
-            <w:r>
-              <w:rPr>
-                <w:rFonts w:ascii="Calibri" w:hAnsi="Calibri"/>
-                <w:b w:val="0"/>
-                <w:color w:val="333333"/>
-                <w:sz w:val="19"/>
-              </w:rPr>
+            <w:r>
+              <w:t>OFI</w:t>
             </w:r>
           </w:p>
         </w:tc>
@@ -4387,17 +4342,8 @@
             <w:vAlign w:val="center"/>
           </w:tcPr>
           <w:p>
-            <w:pPr>
-              <w:jc w:val="left"/>
-            </w:pPr>
-            <w:r/>
-            <w:r>
-              <w:rPr>
-                <w:rFonts w:ascii="Calibri" w:hAnsi="Calibri"/>
-                <w:b w:val="0"/>
-                <w:color w:val="333333"/>
-                <w:sz w:val="19"/>
-              </w:rPr>
+            <w:r>
+              <w:t>Batasan cakupan pengujian in-scope (*.auditsphere.app) dan out-of-scope telah didefinisikan dalam BBP-001; sosialisasi menunggu peluncuran program publik.</w:t>
             </w:r>
           </w:p>
         </w:tc>
@@ -4522,17 +4468,8 @@
             <w:vAlign w:val="center"/>
           </w:tcPr>
           <w:p>
-            <w:pPr>
-              <w:jc w:val="center"/>
-            </w:pPr>
-            <w:r/>
-            <w:r>
-              <w:rPr>
-                <w:rFonts w:ascii="Calibri" w:hAnsi="Calibri"/>
-                <w:b w:val="0"/>
-                <w:color w:val="333333"/>
-                <w:sz w:val="19"/>
-              </w:rPr>
+            <w:r>
+              <w:t>OFI</w:t>
             </w:r>
           </w:p>
         </w:tc>
@@ -4554,17 +4491,8 @@
             <w:vAlign w:val="center"/>
           </w:tcPr>
           <w:p>
-            <w:pPr>
-              <w:jc w:val="left"/>
-            </w:pPr>
-            <w:r/>
-            <w:r>
-              <w:rPr>
-                <w:rFonts w:ascii="Calibri" w:hAnsi="Calibri"/>
-                <w:b w:val="0"/>
-                <w:color w:val="333333"/>
-                <w:sz w:val="19"/>
-              </w:rPr>
+            <w:r>
+              <w:t>Klausul perlindungan hukum Safe Harbor bagi peneliti keamanan telah diadopsi dalam BBP-001 Section 3.2; siap diumumkan bersama program VDP.</w:t>
             </w:r>
           </w:p>
         </w:tc>
@@ -4689,17 +4617,8 @@
             <w:vAlign w:val="center"/>
           </w:tcPr>
           <w:p>
-            <w:pPr>
-              <w:jc w:val="center"/>
-            </w:pPr>
-            <w:r/>
-            <w:r>
-              <w:rPr>
-                <w:rFonts w:ascii="Calibri" w:hAnsi="Calibri"/>
-                <w:b w:val="0"/>
-                <w:color w:val="333333"/>
-                <w:sz w:val="19"/>
-              </w:rPr>
+            <w:r>
+              <w:t>OFI</w:t>
             </w:r>
           </w:p>
         </w:tc>
@@ -4721,17 +4640,8 @@
             <w:vAlign w:val="center"/>
           </w:tcPr>
           <w:p>
-            <w:pPr>
-              <w:jc w:val="left"/>
-            </w:pPr>
-            <w:r/>
-            <w:r>
-              <w:rPr>
-                <w:rFonts w:ascii="Calibri" w:hAnsi="Calibri"/>
-                <w:b w:val="0"/>
-                <w:color w:val="333333"/>
-                <w:sz w:val="19"/>
-              </w:rPr>
+            <w:r>
+              <w:t>Matriks reward berdasarkan CVSS v3.1 telah distandarisasi dalam BBP-001 Section 5; alokasi dana operasional bounty menunggu persetujuan anggaran final.</w:t>
             </w:r>
           </w:p>
         </w:tc>
@@ -4856,17 +4766,8 @@
             <w:vAlign w:val="center"/>
           </w:tcPr>
           <w:p>
-            <w:pPr>
-              <w:jc w:val="center"/>
-            </w:pPr>
-            <w:r/>
-            <w:r>
-              <w:rPr>
-                <w:rFonts w:ascii="Calibri" w:hAnsi="Calibri"/>
-                <w:b w:val="0"/>
-                <w:color w:val="333333"/>
-                <w:sz w:val="19"/>
-              </w:rPr>
+            <w:r>
+              <w:t>OFI</w:t>
             </w:r>
           </w:p>
         </w:tc>
@@ -4888,17 +4789,8 @@
             <w:vAlign w:val="center"/>
           </w:tcPr>
           <w:p>
-            <w:pPr>
-              <w:jc w:val="left"/>
-            </w:pPr>
-            <w:r/>
-            <w:r>
-              <w:rPr>
-                <w:rFonts w:ascii="Calibri" w:hAnsi="Calibri"/>
-                <w:b w:val="0"/>
-                <w:color w:val="333333"/>
-                <w:sz w:val="19"/>
-              </w:rPr>
+            <w:r>
+              <w:t>Prosedur triage laporan dengan SLA respons verifikasi 3 hari kerja telah diatur dalam SOP BBP-001; saat ini dijalankan secara ad-hoc oleh Security Officer.</w:t>
             </w:r>
           </w:p>
         </w:tc>
@@ -5023,17 +4915,8 @@
             <w:vAlign w:val="center"/>
           </w:tcPr>
           <w:p>
-            <w:pPr>
-              <w:jc w:val="center"/>
-            </w:pPr>
-            <w:r/>
-            <w:r>
-              <w:rPr>
-                <w:rFonts w:ascii="Calibri" w:hAnsi="Calibri"/>
-                <w:b w:val="0"/>
-                <w:color w:val="333333"/>
-                <w:sz w:val="19"/>
-              </w:rPr>
+            <w:r>
+              <w:t>OFI</w:t>
             </w:r>
           </w:p>
         </w:tc>
@@ -5055,17 +4938,8 @@
             <w:vAlign w:val="center"/>
           </w:tcPr>
           <w:p>
-            <w:pPr>
-              <w:jc w:val="left"/>
-            </w:pPr>
-            <w:r/>
-            <w:r>
-              <w:rPr>
-                <w:rFonts w:ascii="Calibri" w:hAnsi="Calibri"/>
-                <w:b w:val="0"/>
-                <w:color w:val="333333"/>
-                <w:sz w:val="19"/>
-              </w:rPr>
+            <w:r>
+              <w:t>Verifikasi PoC teknis dan scoring keparahan dilakukan pada security testing internal; format laporan triage standar telah dibakukan.</w:t>
             </w:r>
           </w:p>
         </w:tc>
@@ -5190,17 +5064,8 @@
             <w:vAlign w:val="center"/>
           </w:tcPr>
           <w:p>
-            <w:pPr>
-              <w:jc w:val="center"/>
-            </w:pPr>
-            <w:r/>
-            <w:r>
-              <w:rPr>
-                <w:rFonts w:ascii="Calibri" w:hAnsi="Calibri"/>
-                <w:b w:val="0"/>
-                <w:color w:val="333333"/>
-                <w:sz w:val="19"/>
-              </w:rPr>
+            <w:r>
+              <w:t>OFI</w:t>
             </w:r>
           </w:p>
         </w:tc>
@@ -5222,17 +5087,8 @@
             <w:vAlign w:val="center"/>
           </w:tcPr>
           <w:p>
-            <w:pPr>
-              <w:jc w:val="left"/>
-            </w:pPr>
-            <w:r/>
-            <w:r>
-              <w:rPr>
-                <w:rFonts w:ascii="Calibri" w:hAnsi="Calibri"/>
-                <w:b w:val="0"/>
-                <w:color w:val="333333"/>
-                <w:sz w:val="19"/>
-              </w:rPr>
+            <w:r>
+              <w:t>SLA remediasi kerentanan (Critical ≤ 7 hari, High ≤ 14 hari) diselaraskan dengan tiket backlog pengembangan perangkat lunak.</w:t>
             </w:r>
           </w:p>
         </w:tc>
@@ -5357,17 +5213,8 @@
             <w:vAlign w:val="center"/>
           </w:tcPr>
           <w:p>
-            <w:pPr>
-              <w:jc w:val="center"/>
-            </w:pPr>
-            <w:r/>
-            <w:r>
-              <w:rPr>
-                <w:rFonts w:ascii="Calibri" w:hAnsi="Calibri"/>
-                <w:b w:val="0"/>
-                <w:color w:val="333333"/>
-                <w:sz w:val="19"/>
-              </w:rPr>
+            <w:r>
+              <w:t>OFI</w:t>
             </w:r>
           </w:p>
         </w:tc>
@@ -5389,17 +5236,8 @@
             <w:vAlign w:val="center"/>
           </w:tcPr>
           <w:p>
-            <w:pPr>
-              <w:jc w:val="left"/>
-            </w:pPr>
-            <w:r/>
-            <w:r>
-              <w:rPr>
-                <w:rFonts w:ascii="Calibri" w:hAnsi="Calibri"/>
-                <w:b w:val="0"/>
-                <w:color w:val="333333"/>
-                <w:sz w:val="19"/>
-              </w:rPr>
+            <w:r>
+              <w:t>Mekanisme re-testing pasca-deploy dijalankan oleh tim QA dan DevOps sebelum rilis container ke lingkungan produksi.</w:t>
             </w:r>
           </w:p>
         </w:tc>
@@ -5524,17 +5362,8 @@
             <w:vAlign w:val="center"/>
           </w:tcPr>
           <w:p>
-            <w:pPr>
-              <w:jc w:val="center"/>
-            </w:pPr>
-            <w:r/>
-            <w:r>
-              <w:rPr>
-                <w:rFonts w:ascii="Calibri" w:hAnsi="Calibri"/>
-                <w:b w:val="0"/>
-                <w:color w:val="333333"/>
-                <w:sz w:val="19"/>
-              </w:rPr>
+            <w:r>
+              <w:t>NC</w:t>
             </w:r>
           </w:p>
         </w:tc>
@@ -5556,17 +5385,8 @@
             <w:vAlign w:val="center"/>
           </w:tcPr>
           <w:p>
-            <w:pPr>
-              <w:jc w:val="left"/>
-            </w:pPr>
-            <w:r/>
-            <w:r>
-              <w:rPr>
-                <w:rFonts w:ascii="Calibri" w:hAnsi="Calibri"/>
-                <w:b w:val="0"/>
-                <w:color w:val="333333"/>
-                <w:sz w:val="19"/>
-              </w:rPr>
+            <w:r>
+              <w:t>Integrasi otomatis pencatatan temuan bug bounty ke Corporate Risk Register belum terhubung; pencatatan saat ini masih melalui backlog GitHub Issues (NC-05).</w:t>
             </w:r>
           </w:p>
         </w:tc>
@@ -5691,17 +5511,8 @@
             <w:vAlign w:val="center"/>
           </w:tcPr>
           <w:p>
-            <w:pPr>
-              <w:jc w:val="center"/>
-            </w:pPr>
-            <w:r/>
-            <w:r>
-              <w:rPr>
-                <w:rFonts w:ascii="Calibri" w:hAnsi="Calibri"/>
-                <w:b w:val="0"/>
-                <w:color w:val="333333"/>
-                <w:sz w:val="19"/>
-              </w:rPr>
+            <w:r>
+              <w:t>OFI</w:t>
             </w:r>
           </w:p>
         </w:tc>
@@ -5723,17 +5534,8 @@
             <w:vAlign w:val="center"/>
           </w:tcPr>
           <w:p>
-            <w:pPr>
-              <w:jc w:val="left"/>
-            </w:pPr>
-            <w:r/>
-            <w:r>
-              <w:rPr>
-                <w:rFonts w:ascii="Calibri" w:hAnsi="Calibri"/>
-                <w:b w:val="0"/>
-                <w:color w:val="333333"/>
-                <w:sz w:val="19"/>
-              </w:rPr>
+            <w:r>
+              <w:t>Ketentuan Coordinated Vulnerability Disclosure (CVD) setelah rilis patch telah tertuang dalam BBP-001; siap dieksekusi saat ada laporan terverifikasi.</w:t>
             </w:r>
           </w:p>
         </w:tc>
@@ -5858,17 +5660,8 @@
             <w:vAlign w:val="center"/>
           </w:tcPr>
           <w:p>
-            <w:pPr>
-              <w:jc w:val="center"/>
-            </w:pPr>
-            <w:r/>
-            <w:r>
-              <w:rPr>
-                <w:rFonts w:ascii="Calibri" w:hAnsi="Calibri"/>
-                <w:b w:val="0"/>
-                <w:color w:val="333333"/>
-                <w:sz w:val="19"/>
-              </w:rPr>
+            <w:r>
+              <w:t>OFI</w:t>
             </w:r>
           </w:p>
         </w:tc>
@@ -5890,17 +5683,8 @@
             <w:vAlign w:val="center"/>
           </w:tcPr>
           <w:p>
-            <w:pPr>
-              <w:jc w:val="left"/>
-            </w:pPr>
-            <w:r/>
-            <w:r>
-              <w:rPr>
-                <w:rFonts w:ascii="Calibri" w:hAnsi="Calibri"/>
-                <w:b w:val="0"/>
-                <w:color w:val="333333"/>
-                <w:sz w:val="19"/>
-              </w:rPr>
+            <w:r>
+              <w:t>Halaman apresiasi Hall of Fame telah disiapkan dalam template portal keamanan; aktivasi menunggu peluncuran program bounty publik.</w:t>
             </w:r>
           </w:p>
         </w:tc>
@@ -6681,17 +6465,8 @@
             <w:vAlign w:val="center"/>
           </w:tcPr>
           <w:p>
-            <w:pPr>
-              <w:jc w:val="center"/>
-            </w:pPr>
-            <w:r/>
-            <w:r>
-              <w:rPr>
-                <w:rFonts w:ascii="Calibri" w:hAnsi="Calibri"/>
-                <w:b w:val="0"/>
-                <w:color w:val="333333"/>
-                <w:sz w:val="19"/>
-              </w:rPr>
+            <w:r>
+              <w:t>N/A</w:t>
             </w:r>
           </w:p>
         </w:tc>
@@ -6713,17 +6488,8 @@
             <w:vAlign w:val="center"/>
           </w:tcPr>
           <w:p>
-            <w:pPr>
-              <w:jc w:val="left"/>
-            </w:pPr>
-            <w:r/>
-            <w:r>
-              <w:rPr>
-                <w:rFonts w:ascii="Calibri" w:hAnsi="Calibri"/>
-                <w:b w:val="0"/>
-                <w:color w:val="333333"/>
-                <w:sz w:val="19"/>
-              </w:rPr>
+            <w:r>
+              <w:t>Sistem AuditSphere berjalan di Cloud VPS / containerized environment tanpa server bare-metal fisik; akuisisi disk dilakukan via snapshot cloud terenkripsi, write-blocker fisik tidak relevan.</w:t>
             </w:r>
           </w:p>
         </w:tc>
@@ -6848,17 +6614,8 @@
             <w:vAlign w:val="center"/>
           </w:tcPr>
           <w:p>
-            <w:pPr>
-              <w:jc w:val="center"/>
-            </w:pPr>
-            <w:r/>
-            <w:r>
-              <w:rPr>
-                <w:rFonts w:ascii="Calibri" w:hAnsi="Calibri"/>
-                <w:b w:val="0"/>
-                <w:color w:val="333333"/>
-                <w:sz w:val="19"/>
-              </w:rPr>
+            <w:r>
+              <w:t>NC</w:t>
             </w:r>
           </w:p>
         </w:tc>
@@ -6880,17 +6637,8 @@
             <w:vAlign w:val="center"/>
           </w:tcPr>
           <w:p>
-            <w:pPr>
-              <w:jc w:val="left"/>
-            </w:pPr>
-            <w:r/>
-            <w:r>
-              <w:rPr>
-                <w:rFonts w:ascii="Calibri" w:hAnsi="Calibri"/>
-                <w:b w:val="0"/>
-                <w:color w:val="333333"/>
-                <w:sz w:val="19"/>
-              </w:rPr>
+            <w:r>
+              <w:t>Toolkit akuisisi memori RAM forensik (LiME / Volatility) belum terinstalasi dan terotomasi pada script tanggap darurat di VPS produksi (NC-04).</w:t>
             </w:r>
           </w:p>
         </w:tc>
@@ -7353,17 +7101,8 @@
             <w:vAlign w:val="center"/>
           </w:tcPr>
           <w:p>
-            <w:pPr>
-              <w:jc w:val="center"/>
-            </w:pPr>
-            <w:r/>
-            <w:r>
-              <w:rPr>
-                <w:rFonts w:ascii="Calibri" w:hAnsi="Calibri"/>
-                <w:b w:val="0"/>
-                <w:color w:val="333333"/>
-                <w:sz w:val="19"/>
-              </w:rPr>
+            <w:r>
+              <w:t>OFI</w:t>
             </w:r>
           </w:p>
         </w:tc>
@@ -7385,17 +7124,8 @@
             <w:vAlign w:val="center"/>
           </w:tcPr>
           <w:p>
-            <w:pPr>
-              <w:jc w:val="left"/>
-            </w:pPr>
-            <w:r/>
-            <w:r>
-              <w:rPr>
-                <w:rFonts w:ascii="Calibri" w:hAnsi="Calibri"/>
-                <w:b w:val="0"/>
-                <w:color w:val="333333"/>
-                <w:sz w:val="19"/>
-              </w:rPr>
+            <w:r>
+              <w:t>Template formulir Chain of Custody (CoC) telah dibakukan dalam FRP-001; pencatatan bukti saat ini difokuskan pada log audit Kafka immutable dan snapshot.</w:t>
             </w:r>
           </w:p>
         </w:tc>
@@ -7520,17 +7250,8 @@
             <w:vAlign w:val="center"/>
           </w:tcPr>
           <w:p>
-            <w:pPr>
-              <w:jc w:val="center"/>
-            </w:pPr>
-            <w:r/>
-            <w:r>
-              <w:rPr>
-                <w:rFonts w:ascii="Calibri" w:hAnsi="Calibri"/>
-                <w:b w:val="0"/>
-                <w:color w:val="333333"/>
-                <w:sz w:val="19"/>
-              </w:rPr>
+            <w:r>
+              <w:t>OFI</w:t>
             </w:r>
           </w:p>
         </w:tc>
@@ -7552,17 +7273,8 @@
             <w:vAlign w:val="center"/>
           </w:tcPr>
           <w:p>
-            <w:pPr>
-              <w:jc w:val="left"/>
-            </w:pPr>
-            <w:r/>
-            <w:r>
-              <w:rPr>
-                <w:rFonts w:ascii="Calibri" w:hAnsi="Calibri"/>
-                <w:b w:val="0"/>
-                <w:color w:val="333333"/>
-                <w:sz w:val="19"/>
-              </w:rPr>
+            <w:r>
+              <w:t>Analisis artefak digital dilakukan pada isolated sandbox VM terpisah dari jaringan produksi; fasilitas air-gapped lab fisik tidak digunakan.</w:t>
             </w:r>
           </w:p>
         </w:tc>
@@ -7856,17 +7568,8 @@
             <w:vAlign w:val="center"/>
           </w:tcPr>
           <w:p>
-            <w:pPr>
-              <w:jc w:val="center"/>
-            </w:pPr>
-            <w:r/>
-            <w:r>
-              <w:rPr>
-                <w:rFonts w:ascii="Calibri" w:hAnsi="Calibri"/>
-                <w:b w:val="0"/>
-                <w:color w:val="333333"/>
-                <w:sz w:val="19"/>
-              </w:rPr>
+            <w:r>
+              <w:t>NC</w:t>
             </w:r>
           </w:p>
         </w:tc>
@@ -7888,17 +7591,8 @@
             <w:vAlign w:val="center"/>
           </w:tcPr>
           <w:p>
-            <w:pPr>
-              <w:jc w:val="left"/>
-            </w:pPr>
-            <w:r/>
-            <w:r>
-              <w:rPr>
-                <w:rFonts w:ascii="Calibri" w:hAnsi="Calibri"/>
-                <w:b w:val="0"/>
-                <w:color w:val="333333"/>
-                <w:sz w:val="19"/>
-              </w:rPr>
+            <w:r>
+              <w:t>Pelatihan berkala analisis forensik digital dan sertifikasi formal penanganan insiden untuk tim SOC/IR belum dilaksanakan pada siklus tahun berjalan (NC-06).</w:t>
             </w:r>
           </w:p>
         </w:tc>
@@ -9355,17 +9049,8 @@
             <w:vAlign w:val="center"/>
           </w:tcPr>
           <w:p>
-            <w:pPr>
-              <w:jc w:val="center"/>
-            </w:pPr>
-            <w:r/>
-            <w:r>
-              <w:rPr>
-                <w:rFonts w:ascii="Calibri" w:hAnsi="Calibri"/>
-                <w:b w:val="0"/>
-                <w:color w:val="333333"/>
-                <w:sz w:val="19"/>
-              </w:rPr>
+            <w:r>
+              <w:t>OFI</w:t>
             </w:r>
           </w:p>
         </w:tc>
@@ -9387,17 +9072,8 @@
             <w:vAlign w:val="center"/>
           </w:tcPr>
           <w:p>
-            <w:pPr>
-              <w:jc w:val="left"/>
-            </w:pPr>
-            <w:r/>
-            <w:r>
-              <w:rPr>
-                <w:rFonts w:ascii="Calibri" w:hAnsi="Calibri"/>
-                <w:b w:val="0"/>
-                <w:color w:val="333333"/>
-                <w:sz w:val="19"/>
-              </w:rPr>
+            <w:r>
+              <w:t>Pengujian Initial Access pada perimeter web/API dilakukan secara berkala melalui pre-pentest; simulasi spear-phishing terotorisasi dalam jadwal tahunan.</w:t>
             </w:r>
           </w:p>
         </w:tc>
@@ -9522,17 +9198,8 @@
             <w:vAlign w:val="center"/>
           </w:tcPr>
           <w:p>
-            <w:pPr>
-              <w:jc w:val="center"/>
-            </w:pPr>
-            <w:r/>
-            <w:r>
-              <w:rPr>
-                <w:rFonts w:ascii="Calibri" w:hAnsi="Calibri"/>
-                <w:b w:val="0"/>
-                <w:color w:val="333333"/>
-                <w:sz w:val="19"/>
-              </w:rPr>
+            <w:r>
+              <w:t>OFI</w:t>
             </w:r>
           </w:p>
         </w:tc>
@@ -9554,17 +9221,8 @@
             <w:vAlign w:val="center"/>
           </w:tcPr>
           <w:p>
-            <w:pPr>
-              <w:jc w:val="left"/>
-            </w:pPr>
-            <w:r/>
-            <w:r>
-              <w:rPr>
-                <w:rFonts w:ascii="Calibri" w:hAnsi="Calibri"/>
-                <w:b w:val="0"/>
-                <w:color w:val="333333"/>
-                <w:sz w:val="19"/>
-              </w:rPr>
+            <w:r>
+              <w:t>Uji eskalasi hak akses (privilege escalation) telah diuji pada staging; simulasi lateral movement dan exfiltration terpadu masuk agenda Purple Team.</w:t>
             </w:r>
           </w:p>
         </w:tc>
@@ -9689,17 +9347,8 @@
             <w:vAlign w:val="center"/>
           </w:tcPr>
           <w:p>
-            <w:pPr>
-              <w:jc w:val="center"/>
-            </w:pPr>
-            <w:r/>
-            <w:r>
-              <w:rPr>
-                <w:rFonts w:ascii="Calibri" w:hAnsi="Calibri"/>
-                <w:b w:val="0"/>
-                <w:color w:val="333333"/>
-                <w:sz w:val="19"/>
-              </w:rPr>
+            <w:r>
+              <w:t>NC</w:t>
             </w:r>
           </w:p>
         </w:tc>
@@ -9721,17 +9370,8 @@
             <w:vAlign w:val="center"/>
           </w:tcPr>
           <w:p>
-            <w:pPr>
-              <w:jc w:val="left"/>
-            </w:pPr>
-            <w:r/>
-            <w:r>
-              <w:rPr>
-                <w:rFonts w:ascii="Calibri" w:hAnsi="Calibri"/>
-                <w:b w:val="0"/>
-                <w:color w:val="333333"/>
-                <w:sz w:val="19"/>
-              </w:rPr>
+            <w:r>
+              <w:t>Simulasi gabungan Purple Team terjadwal secara langsung di server produksi auditsphere.app belum pernah dilaksanakan (NC-02).</w:t>
             </w:r>
           </w:p>
         </w:tc>
@@ -9856,17 +9496,8 @@
             <w:vAlign w:val="center"/>
           </w:tcPr>
           <w:p>
-            <w:pPr>
-              <w:jc w:val="center"/>
-            </w:pPr>
-            <w:r/>
-            <w:r>
-              <w:rPr>
-                <w:rFonts w:ascii="Calibri" w:hAnsi="Calibri"/>
-                <w:b w:val="0"/>
-                <w:color w:val="333333"/>
-                <w:sz w:val="19"/>
-              </w:rPr>
+            <w:r>
+              <w:t>OFI</w:t>
             </w:r>
           </w:p>
         </w:tc>
@@ -9888,17 +9519,8 @@
             <w:vAlign w:val="center"/>
           </w:tcPr>
           <w:p>
-            <w:pPr>
-              <w:jc w:val="left"/>
-            </w:pPr>
-            <w:r/>
-            <w:r>
-              <w:rPr>
-                <w:rFonts w:ascii="Calibri" w:hAnsi="Calibri"/>
-                <w:b w:val="0"/>
-                <w:color w:val="333333"/>
-                <w:sz w:val="19"/>
-              </w:rPr>
+            <w:r>
+              <w:t>Target SLA MTTD (&lt;1 jam) dan MTTR (&lt;4 jam) telah ditetapkan dalam dokumen RTP-001; dashboard pengukuran otomatis terintegrasi sedang dikembangkan.</w:t>
             </w:r>
           </w:p>
         </w:tc>
@@ -10023,17 +9645,8 @@
             <w:vAlign w:val="center"/>
           </w:tcPr>
           <w:p>
-            <w:pPr>
-              <w:jc w:val="center"/>
-            </w:pPr>
-            <w:r/>
-            <w:r>
-              <w:rPr>
-                <w:rFonts w:ascii="Calibri" w:hAnsi="Calibri"/>
-                <w:b w:val="0"/>
-                <w:color w:val="333333"/>
-                <w:sz w:val="19"/>
-              </w:rPr>
+            <w:r>
+              <w:t>OFI</w:t>
             </w:r>
           </w:p>
         </w:tc>
@@ -10055,17 +9668,8 @@
             <w:vAlign w:val="center"/>
           </w:tcPr>
           <w:p>
-            <w:pPr>
-              <w:jc w:val="left"/>
-            </w:pPr>
-            <w:r/>
-            <w:r>
-              <w:rPr>
-                <w:rFonts w:ascii="Calibri" w:hAnsi="Calibri"/>
-                <w:b w:val="0"/>
-                <w:color w:val="333333"/>
-                <w:sz w:val="19"/>
-              </w:rPr>
+            <w:r>
+              <w:t>Template laporan gabungan Purple Team Report telah distandarisasi dalam RTP-001; penerbitan menunggu eksekusi simulasi terjadwal.</w:t>
             </w:r>
           </w:p>
         </w:tc>
@@ -10190,17 +9794,8 @@
             <w:vAlign w:val="center"/>
           </w:tcPr>
           <w:p>
-            <w:pPr>
-              <w:jc w:val="center"/>
-            </w:pPr>
-            <w:r/>
-            <w:r>
-              <w:rPr>
-                <w:rFonts w:ascii="Calibri" w:hAnsi="Calibri"/>
-                <w:b w:val="0"/>
-                <w:color w:val="333333"/>
-                <w:sz w:val="19"/>
-              </w:rPr>
+            <w:r>
+              <w:t>OFI</w:t>
             </w:r>
           </w:p>
         </w:tc>
@@ -10222,17 +9817,8 @@
             <w:vAlign w:val="center"/>
           </w:tcPr>
           <w:p>
-            <w:pPr>
-              <w:jc w:val="left"/>
-            </w:pPr>
-            <w:r/>
-            <w:r>
-              <w:rPr>
-                <w:rFonts w:ascii="Calibri" w:hAnsi="Calibri"/>
-                <w:b w:val="0"/>
-                <w:color w:val="333333"/>
-                <w:sz w:val="19"/>
-              </w:rPr>
+            <w:r>
+              <w:t>Pelacakan remediasi temuan kelemahan pertahanan dikelola melalui board GitHub Issues dengan penanggung jawab Engineering Lead.</w:t>
             </w:r>
           </w:p>
         </w:tc>
@@ -11013,17 +10599,8 @@
             <w:vAlign w:val="center"/>
           </w:tcPr>
           <w:p>
-            <w:pPr>
-              <w:jc w:val="center"/>
-            </w:pPr>
-            <w:r/>
-            <w:r>
-              <w:rPr>
-                <w:rFonts w:ascii="Calibri" w:hAnsi="Calibri"/>
-                <w:b w:val="0"/>
-                <w:color w:val="333333"/>
-                <w:sz w:val="19"/>
-              </w:rPr>
+            <w:r>
+              <w:t>NC</w:t>
             </w:r>
           </w:p>
         </w:tc>
@@ -11045,17 +10622,8 @@
             <w:vAlign w:val="center"/>
           </w:tcPr>
           <w:p>
-            <w:pPr>
-              <w:jc w:val="left"/>
-            </w:pPr>
-            <w:r/>
-            <w:r>
-              <w:rPr>
-                <w:rFonts w:ascii="Calibri" w:hAnsi="Calibri"/>
-                <w:b w:val="0"/>
-                <w:color w:val="333333"/>
-                <w:sz w:val="19"/>
-              </w:rPr>
+            <w:r>
+              <w:t>Integrasi automated CTI feed (BSSN, AlienVault OTX, MISP) ke rule perimeter firewall Kong belum terpasang otomatis (NC-03).</w:t>
             </w:r>
           </w:p>
         </w:tc>
@@ -11856,17 +11424,8 @@
             <w:vAlign w:val="center"/>
           </w:tcPr>
           <w:p>
-            <w:pPr>
-              <w:jc w:val="center"/>
-            </w:pPr>
-            <w:r/>
-            <w:r>
-              <w:rPr>
-                <w:rFonts w:ascii="Calibri" w:hAnsi="Calibri"/>
-                <w:b w:val="0"/>
-                <w:color w:val="333333"/>
-                <w:sz w:val="19"/>
-              </w:rPr>
+            <w:r>
+              <w:t>OFI</w:t>
             </w:r>
           </w:p>
         </w:tc>
@@ -11888,17 +11447,8 @@
             <w:vAlign w:val="center"/>
           </w:tcPr>
           <w:p>
-            <w:pPr>
-              <w:jc w:val="left"/>
-            </w:pPr>
-            <w:r/>
-            <w:r>
-              <w:rPr>
-                <w:rFonts w:ascii="Calibri" w:hAnsi="Calibri"/>
-                <w:b w:val="0"/>
-                <w:color w:val="333333"/>
-                <w:sz w:val="19"/>
-              </w:rPr>
+            <w:r>
+              <w:t>Prosedur intelijen TIP-001 telah disahkan; instance Threat Intelligence Platform (OpenCTI/MISP) saat ini beroperasi pada lingkungan lab internal.</w:t>
             </w:r>
           </w:p>
         </w:tc>
@@ -12023,17 +11573,8 @@
             <w:vAlign w:val="center"/>
           </w:tcPr>
           <w:p>
-            <w:pPr>
-              <w:jc w:val="center"/>
-            </w:pPr>
-            <w:r/>
-            <w:r>
-              <w:rPr>
-                <w:rFonts w:ascii="Calibri" w:hAnsi="Calibri"/>
-                <w:b w:val="0"/>
-                <w:color w:val="333333"/>
-                <w:sz w:val="19"/>
-              </w:rPr>
+            <w:r>
+              <w:t>OFI</w:t>
             </w:r>
           </w:p>
         </w:tc>
@@ -12055,17 +11596,8 @@
             <w:vAlign w:val="center"/>
           </w:tcPr>
           <w:p>
-            <w:pPr>
-              <w:jc w:val="left"/>
-            </w:pPr>
-            <w:r/>
-            <w:r>
-              <w:rPr>
-                <w:rFonts w:ascii="Calibri" w:hAnsi="Calibri"/>
-                <w:b w:val="0"/>
-                <w:color w:val="333333"/>
-                <w:sz w:val="19"/>
-              </w:rPr>
+            <w:r>
+              <w:t>Ketentuan de-duplikasi dan normalisasi IoC telah diatur dalam TIP-001 Section 4; proses enrichment otomatis berbasis API sedang dioptimalkan.</w:t>
             </w:r>
           </w:p>
         </w:tc>
@@ -12190,17 +11722,8 @@
             <w:vAlign w:val="center"/>
           </w:tcPr>
           <w:p>
-            <w:pPr>
-              <w:jc w:val="center"/>
-            </w:pPr>
-            <w:r/>
-            <w:r>
-              <w:rPr>
-                <w:rFonts w:ascii="Calibri" w:hAnsi="Calibri"/>
-                <w:b w:val="0"/>
-                <w:color w:val="333333"/>
-                <w:sz w:val="19"/>
-              </w:rPr>
+            <w:r>
+              <w:t>OFI</w:t>
             </w:r>
           </w:p>
         </w:tc>
@@ -12222,17 +11745,8 @@
             <w:vAlign w:val="center"/>
           </w:tcPr>
           <w:p>
-            <w:pPr>
-              <w:jc w:val="left"/>
-            </w:pPr>
-            <w:r/>
-            <w:r>
-              <w:rPr>
-                <w:rFonts w:ascii="Calibri" w:hAnsi="Calibri"/>
-                <w:b w:val="0"/>
-                <w:color w:val="333333"/>
-                <w:sz w:val="19"/>
-              </w:rPr>
+            <w:r>
+              <w:t>Pembaruan rule WAF Kong dilakukan semi-otomatis melalui git sync repositori konfigurasi; pembaruan otomatis sub-24 jam dalam tahap integrasi CI/CD.</w:t>
             </w:r>
           </w:p>
         </w:tc>
@@ -12357,17 +11871,8 @@
             <w:vAlign w:val="center"/>
           </w:tcPr>
           <w:p>
-            <w:pPr>
-              <w:jc w:val="center"/>
-            </w:pPr>
-            <w:r/>
-            <w:r>
-              <w:rPr>
-                <w:rFonts w:ascii="Calibri" w:hAnsi="Calibri"/>
-                <w:b w:val="0"/>
-                <w:color w:val="333333"/>
-                <w:sz w:val="19"/>
-              </w:rPr>
+            <w:r>
+              <w:t>OFI</w:t>
             </w:r>
           </w:p>
         </w:tc>
@@ -12389,17 +11894,8 @@
             <w:vAlign w:val="center"/>
           </w:tcPr>
           <w:p>
-            <w:pPr>
-              <w:jc w:val="left"/>
-            </w:pPr>
-            <w:r/>
-            <w:r>
-              <w:rPr>
-                <w:rFonts w:ascii="Calibri" w:hAnsi="Calibri"/>
-                <w:b w:val="0"/>
-                <w:color w:val="333333"/>
-                <w:sz w:val="19"/>
-              </w:rPr>
+            <w:r>
+              <w:t>Metrik akurasi CTI dan evaluasi false-positive rate telah ditentukan dalam KPI TIP-001; evaluasi berkala dilakukan saat security review.</w:t>
             </w:r>
           </w:p>
         </w:tc>
@@ -14025,17 +13521,8 @@
             <w:vAlign w:val="center"/>
           </w:tcPr>
           <w:p>
-            <w:pPr>
-              <w:jc w:val="center"/>
-            </w:pPr>
-            <w:r/>
-            <w:r>
-              <w:rPr>
-                <w:rFonts w:ascii="Calibri" w:hAnsi="Calibri"/>
-                <w:b w:val="0"/>
-                <w:color w:val="333333"/>
-                <w:sz w:val="19"/>
-              </w:rPr>
+            <w:r>
+              <w:t>NC</w:t>
             </w:r>
           </w:p>
         </w:tc>
@@ -14057,17 +13544,8 @@
             <w:vAlign w:val="center"/>
           </w:tcPr>
           <w:p>
-            <w:pPr>
-              <w:jc w:val="left"/>
-            </w:pPr>
-            <w:r/>
-            <w:r>
-              <w:rPr>
-                <w:rFonts w:ascii="Calibri" w:hAnsi="Calibri"/>
-                <w:b w:val="0"/>
-                <w:color w:val="333333"/>
-                <w:sz w:val="19"/>
-              </w:rPr>
+            <w:r>
+              <w:t>Sistem Data Loss Prevention (DLP) otomatis berbasis inspeksi konten muatan HTTP belum aktif pada API Gateway perimeter (NC-07).</w:t>
             </w:r>
           </w:p>
         </w:tc>
@@ -14192,17 +13670,8 @@
             <w:vAlign w:val="center"/>
           </w:tcPr>
           <w:p>
-            <w:pPr>
-              <w:jc w:val="center"/>
-            </w:pPr>
-            <w:r/>
-            <w:r>
-              <w:rPr>
-                <w:rFonts w:ascii="Calibri" w:hAnsi="Calibri"/>
-                <w:b w:val="0"/>
-                <w:color w:val="333333"/>
-                <w:sz w:val="19"/>
-              </w:rPr>
+            <w:r>
+              <w:t>OFI</w:t>
             </w:r>
           </w:p>
         </w:tc>
@@ -14224,17 +13693,8 @@
             <w:vAlign w:val="center"/>
           </w:tcPr>
           <w:p>
-            <w:pPr>
-              <w:jc w:val="left"/>
-            </w:pPr>
-            <w:r/>
-            <w:r>
-              <w:rPr>
-                <w:rFonts w:ascii="Calibri" w:hAnsi="Calibri"/>
-                <w:b w:val="0"/>
-                <w:color w:val="333333"/>
-                <w:sz w:val="19"/>
-              </w:rPr>
+            <w:r>
+              <w:t>Monitoring aktivitas pengguna terpusat pada audit trail Kafka; analitik perilaku lanjutan (UEBA) direncanakan pada Roadmap ZTA Tahap 3.</w:t>
             </w:r>
           </w:p>
         </w:tc>
@@ -14359,17 +13819,8 @@
             <w:vAlign w:val="center"/>
           </w:tcPr>
           <w:p>
-            <w:pPr>
-              <w:jc w:val="center"/>
-            </w:pPr>
-            <w:r/>
-            <w:r>
-              <w:rPr>
-                <w:rFonts w:ascii="Calibri" w:hAnsi="Calibri"/>
-                <w:b w:val="0"/>
-                <w:color w:val="333333"/>
-                <w:sz w:val="19"/>
-              </w:rPr>
+            <w:r>
+              <w:t>OFI</w:t>
             </w:r>
           </w:p>
         </w:tc>
@@ -14391,17 +13842,8 @@
             <w:vAlign w:val="center"/>
           </w:tcPr>
           <w:p>
-            <w:pPr>
-              <w:jc w:val="left"/>
-            </w:pPr>
-            <w:r/>
-            <w:r>
-              <w:rPr>
-                <w:rFonts w:ascii="Calibri" w:hAnsi="Calibri"/>
-                <w:b w:val="0"/>
-                <w:color w:val="333333"/>
-                <w:sz w:val="19"/>
-              </w:rPr>
+            <w:r>
+              <w:t>Mekanisme pemblokiran IP otomatis dan isolasi token aktif di Kong WAF; orkestrasi playbook SOAR menyeluruh dalam perancangan arsitektur.</w:t>
             </w:r>
           </w:p>
         </w:tc>
@@ -20415,816 +19857,434 @@
         </w:tc>
       </w:tr>
       <w:tr>
-        <w:trPr>
-          <w:cantSplit/>
-        </w:trPr>
-        <w:tc>
-          <w:tcPr>
-            <w:tcW w:type="dxa" w:w="1000"/>
-            <w:shd w:fill="F2F2F2"/>
-            <w:tcMar>
-              <w:top w:w="60" w:type="dxa"/>
-              <w:bottom w:w="60" w:type="dxa"/>
-              <w:left w:w="90" w:type="dxa"/>
-              <w:right w:w="90" w:type="dxa"/>
-            </w:tcMar>
-            <w:tcBorders>
-              <w:top w:val="single" w:sz="4" w:space="0" w:color="A6A6A6"/>
-              <w:bottom w:val="single" w:sz="4" w:space="0" w:color="A6A6A6"/>
-              <w:left w:val="single" w:sz="4" w:space="0" w:color="A6A6A6"/>
-              <w:right w:val="single" w:sz="4" w:space="0" w:color="A6A6A6"/>
-            </w:tcBorders>
-            <w:vAlign w:val="center"/>
-          </w:tcPr>
-          <w:p>
-            <w:pPr>
-              <w:jc w:val="center"/>
-            </w:pPr>
-            <w:r/>
-            <w:r>
-              <w:rPr>
-                <w:rFonts w:ascii="Calibri" w:hAnsi="Calibri"/>
-                <w:b/>
-                <w:color w:val="333333"/>
-                <w:sz w:val="19"/>
-              </w:rPr>
+        <w:tc>
+          <w:tcPr>
+            <w:tcW w:type="dxa" w:w="1504"/>
+          </w:tcPr>
+          <w:p>
+            <w:r>
               <w:t>NC-01</w:t>
             </w:r>
           </w:p>
         </w:tc>
         <w:tc>
           <w:tcPr>
-            <w:tcW w:type="dxa" w:w="3226"/>
-            <w:tcMar>
-              <w:top w:w="60" w:type="dxa"/>
-              <w:bottom w:w="60" w:type="dxa"/>
-              <w:left w:w="90" w:type="dxa"/>
-              <w:right w:w="90" w:type="dxa"/>
-            </w:tcMar>
-            <w:tcBorders>
-              <w:top w:val="single" w:sz="4" w:space="0" w:color="A6A6A6"/>
-              <w:bottom w:val="single" w:sz="4" w:space="0" w:color="A6A6A6"/>
-              <w:left w:val="single" w:sz="4" w:space="0" w:color="A6A6A6"/>
-              <w:right w:val="single" w:sz="4" w:space="0" w:color="A6A6A6"/>
-            </w:tcBorders>
-            <w:vAlign w:val="center"/>
-          </w:tcPr>
-          <w:p>
-            <w:pPr>
-              <w:jc w:val="left"/>
-            </w:pPr>
-            <w:r/>
-            <w:r>
-              <w:rPr>
-                <w:rFonts w:ascii="Calibri" w:hAnsi="Calibri"/>
-                <w:b w:val="0"/>
-                <w:color w:val="333333"/>
-                <w:sz w:val="19"/>
-              </w:rPr>
-              <w:t>Program Bug Bounty publik belum diluncurkan pada platform pihak ketiga (HackerOne/Bugcrowd)</w:t>
-            </w:r>
-          </w:p>
-        </w:tc>
-        <w:tc>
-          <w:tcPr>
-            <w:tcW w:type="dxa" w:w="1100"/>
-            <w:tcMar>
-              <w:top w:w="60" w:type="dxa"/>
-              <w:bottom w:w="60" w:type="dxa"/>
-              <w:left w:w="90" w:type="dxa"/>
-              <w:right w:w="90" w:type="dxa"/>
-            </w:tcMar>
-            <w:tcBorders>
-              <w:top w:val="single" w:sz="4" w:space="0" w:color="A6A6A6"/>
-              <w:bottom w:val="single" w:sz="4" w:space="0" w:color="A6A6A6"/>
-              <w:left w:val="single" w:sz="4" w:space="0" w:color="A6A6A6"/>
-              <w:right w:val="single" w:sz="4" w:space="0" w:color="A6A6A6"/>
-            </w:tcBorders>
-            <w:vAlign w:val="center"/>
-          </w:tcPr>
-          <w:p>
-            <w:pPr>
-              <w:jc w:val="center"/>
-            </w:pPr>
-            <w:r/>
-            <w:r>
-              <w:rPr>
-                <w:rFonts w:ascii="Calibri" w:hAnsi="Calibri"/>
-                <w:b/>
-                <w:color w:val="333333"/>
-                <w:sz w:val="19"/>
-              </w:rPr>
+            <w:tcW w:type="dxa" w:w="1504"/>
+          </w:tcPr>
+          <w:p>
+            <w:r>
+              <w:t>Program Bug Bounty publik belum diluncurkan pada platform pihak ketiga (HackerOne/Bugcrowd) [Item 2]</w:t>
+            </w:r>
+          </w:p>
+        </w:tc>
+        <w:tc>
+          <w:tcPr>
+            <w:tcW w:type="dxa" w:w="1504"/>
+          </w:tcPr>
+          <w:p>
+            <w:r>
               <w:t>Medium</w:t>
             </w:r>
           </w:p>
         </w:tc>
         <w:tc>
           <w:tcPr>
-            <w:tcW w:type="dxa" w:w="1300"/>
-            <w:tcMar>
-              <w:top w:w="60" w:type="dxa"/>
-              <w:bottom w:w="60" w:type="dxa"/>
-              <w:left w:w="90" w:type="dxa"/>
-              <w:right w:w="90" w:type="dxa"/>
-            </w:tcMar>
-            <w:tcBorders>
-              <w:top w:val="single" w:sz="4" w:space="0" w:color="A6A6A6"/>
-              <w:bottom w:val="single" w:sz="4" w:space="0" w:color="A6A6A6"/>
-              <w:left w:val="single" w:sz="4" w:space="0" w:color="A6A6A6"/>
-              <w:right w:val="single" w:sz="4" w:space="0" w:color="A6A6A6"/>
-            </w:tcBorders>
-            <w:vAlign w:val="center"/>
-          </w:tcPr>
-          <w:p>
-            <w:pPr>
-              <w:jc w:val="left"/>
-            </w:pPr>
-            <w:r/>
-            <w:r>
-              <w:rPr>
-                <w:rFonts w:ascii="Calibri" w:hAnsi="Calibri"/>
-                <w:b w:val="0"/>
-                <w:color w:val="333333"/>
-                <w:sz w:val="19"/>
-              </w:rPr>
+            <w:tcW w:type="dxa" w:w="1504"/>
+          </w:tcPr>
+          <w:p>
+            <w:r>
               <w:t>Security Officer</w:t>
             </w:r>
           </w:p>
         </w:tc>
         <w:tc>
           <w:tcPr>
-            <w:tcW w:type="dxa" w:w="1200"/>
-            <w:tcMar>
-              <w:top w:w="60" w:type="dxa"/>
-              <w:bottom w:w="60" w:type="dxa"/>
-              <w:left w:w="90" w:type="dxa"/>
-              <w:right w:w="90" w:type="dxa"/>
-            </w:tcMar>
-            <w:tcBorders>
-              <w:top w:val="single" w:sz="4" w:space="0" w:color="A6A6A6"/>
-              <w:bottom w:val="single" w:sz="4" w:space="0" w:color="A6A6A6"/>
-              <w:left w:val="single" w:sz="4" w:space="0" w:color="A6A6A6"/>
-              <w:right w:val="single" w:sz="4" w:space="0" w:color="A6A6A6"/>
-            </w:tcBorders>
-            <w:vAlign w:val="center"/>
-          </w:tcPr>
-          <w:p>
-            <w:pPr>
-              <w:jc w:val="center"/>
-            </w:pPr>
-            <w:r/>
-            <w:r>
-              <w:rPr>
-                <w:rFonts w:ascii="Calibri" w:hAnsi="Calibri"/>
-                <w:b w:val="0"/>
-                <w:color w:val="333333"/>
-                <w:sz w:val="19"/>
-              </w:rPr>
+            <w:tcW w:type="dxa" w:w="1504"/>
+          </w:tcPr>
+          <w:p>
+            <w:r>
               <w:t>60 Hari</w:t>
             </w:r>
           </w:p>
         </w:tc>
         <w:tc>
           <w:tcPr>
-            <w:tcW w:type="dxa" w:w="1200"/>
-            <w:tcMar>
-              <w:top w:w="60" w:type="dxa"/>
-              <w:bottom w:w="60" w:type="dxa"/>
-              <w:left w:w="90" w:type="dxa"/>
-              <w:right w:w="90" w:type="dxa"/>
-            </w:tcMar>
-            <w:tcBorders>
-              <w:top w:val="single" w:sz="4" w:space="0" w:color="A6A6A6"/>
-              <w:bottom w:val="single" w:sz="4" w:space="0" w:color="A6A6A6"/>
-              <w:left w:val="single" w:sz="4" w:space="0" w:color="A6A6A6"/>
-              <w:right w:val="single" w:sz="4" w:space="0" w:color="A6A6A6"/>
-            </w:tcBorders>
-            <w:vAlign w:val="center"/>
-          </w:tcPr>
-          <w:p>
-            <w:pPr>
-              <w:jc w:val="center"/>
-            </w:pPr>
-            <w:r/>
-            <w:r>
-              <w:rPr>
-                <w:rFonts w:ascii="Calibri" w:hAnsi="Calibri"/>
-                <w:b/>
-                <w:color w:val="1F3864"/>
-                <w:sz w:val="19"/>
-              </w:rPr>
+            <w:tcW w:type="dxa" w:w="1504"/>
+          </w:tcPr>
+          <w:p>
+            <w:r>
               <w:t>Open</w:t>
             </w:r>
           </w:p>
         </w:tc>
       </w:tr>
       <w:tr>
-        <w:trPr>
-          <w:cantSplit/>
-        </w:trPr>
-        <w:tc>
-          <w:tcPr>
-            <w:tcW w:type="dxa" w:w="1000"/>
-            <w:shd w:fill="F2F2F2"/>
-            <w:tcMar>
-              <w:top w:w="60" w:type="dxa"/>
-              <w:bottom w:w="60" w:type="dxa"/>
-              <w:left w:w="90" w:type="dxa"/>
-              <w:right w:w="90" w:type="dxa"/>
-            </w:tcMar>
-            <w:tcBorders>
-              <w:top w:val="single" w:sz="4" w:space="0" w:color="A6A6A6"/>
-              <w:bottom w:val="single" w:sz="4" w:space="0" w:color="A6A6A6"/>
-              <w:left w:val="single" w:sz="4" w:space="0" w:color="A6A6A6"/>
-              <w:right w:val="single" w:sz="4" w:space="0" w:color="A6A6A6"/>
-            </w:tcBorders>
-            <w:vAlign w:val="center"/>
-          </w:tcPr>
-          <w:p>
-            <w:pPr>
-              <w:jc w:val="center"/>
-            </w:pPr>
-            <w:r/>
-            <w:r>
-              <w:rPr>
-                <w:rFonts w:ascii="Calibri" w:hAnsi="Calibri"/>
-                <w:b/>
-                <w:color w:val="333333"/>
-                <w:sz w:val="19"/>
-              </w:rPr>
+        <w:tc>
+          <w:tcPr>
+            <w:tcW w:type="dxa" w:w="1504"/>
+          </w:tcPr>
+          <w:p>
+            <w:r>
               <w:t>NC-02</w:t>
             </w:r>
           </w:p>
         </w:tc>
         <w:tc>
           <w:tcPr>
-            <w:tcW w:type="dxa" w:w="3226"/>
-            <w:tcMar>
-              <w:top w:w="60" w:type="dxa"/>
-              <w:bottom w:w="60" w:type="dxa"/>
-              <w:left w:w="90" w:type="dxa"/>
-              <w:right w:w="90" w:type="dxa"/>
-            </w:tcMar>
-            <w:tcBorders>
-              <w:top w:val="single" w:sz="4" w:space="0" w:color="A6A6A6"/>
-              <w:bottom w:val="single" w:sz="4" w:space="0" w:color="A6A6A6"/>
-              <w:left w:val="single" w:sz="4" w:space="0" w:color="A6A6A6"/>
-              <w:right w:val="single" w:sz="4" w:space="0" w:color="A6A6A6"/>
-            </w:tcBorders>
-            <w:vAlign w:val="center"/>
-          </w:tcPr>
-          <w:p>
-            <w:pPr>
-              <w:jc w:val="left"/>
-            </w:pPr>
-            <w:r/>
-            <w:r>
-              <w:rPr>
-                <w:rFonts w:ascii="Calibri" w:hAnsi="Calibri"/>
-                <w:b w:val="0"/>
-                <w:color w:val="333333"/>
-                <w:sz w:val="19"/>
-              </w:rPr>
-              <w:t>Simulasi serangan adversary Red Team / Purple Team belum dieksekusi di server produksi auditsphere.app</w:t>
-            </w:r>
-          </w:p>
-        </w:tc>
-        <w:tc>
-          <w:tcPr>
-            <w:tcW w:type="dxa" w:w="1100"/>
-            <w:tcMar>
-              <w:top w:w="60" w:type="dxa"/>
-              <w:bottom w:w="60" w:type="dxa"/>
-              <w:left w:w="90" w:type="dxa"/>
-              <w:right w:w="90" w:type="dxa"/>
-            </w:tcMar>
-            <w:tcBorders>
-              <w:top w:val="single" w:sz="4" w:space="0" w:color="A6A6A6"/>
-              <w:bottom w:val="single" w:sz="4" w:space="0" w:color="A6A6A6"/>
-              <w:left w:val="single" w:sz="4" w:space="0" w:color="A6A6A6"/>
-              <w:right w:val="single" w:sz="4" w:space="0" w:color="A6A6A6"/>
-            </w:tcBorders>
-            <w:vAlign w:val="center"/>
-          </w:tcPr>
-          <w:p>
-            <w:pPr>
-              <w:jc w:val="center"/>
-            </w:pPr>
-            <w:r/>
-            <w:r>
-              <w:rPr>
-                <w:rFonts w:ascii="Calibri" w:hAnsi="Calibri"/>
-                <w:b/>
-                <w:color w:val="333333"/>
-                <w:sz w:val="19"/>
-              </w:rPr>
+            <w:tcW w:type="dxa" w:w="1504"/>
+          </w:tcPr>
+          <w:p>
+            <w:r>
+              <w:t>Simulasi serangan adversary Red Team / Purple Team belum dieksekusi di server produksi auditsphere.app [Item 33]</w:t>
+            </w:r>
+          </w:p>
+        </w:tc>
+        <w:tc>
+          <w:tcPr>
+            <w:tcW w:type="dxa" w:w="1504"/>
+          </w:tcPr>
+          <w:p>
+            <w:r>
               <w:t>High</w:t>
             </w:r>
           </w:p>
         </w:tc>
         <w:tc>
           <w:tcPr>
-            <w:tcW w:type="dxa" w:w="1300"/>
-            <w:tcMar>
-              <w:top w:w="60" w:type="dxa"/>
-              <w:bottom w:w="60" w:type="dxa"/>
-              <w:left w:w="90" w:type="dxa"/>
-              <w:right w:w="90" w:type="dxa"/>
-            </w:tcMar>
-            <w:tcBorders>
-              <w:top w:val="single" w:sz="4" w:space="0" w:color="A6A6A6"/>
-              <w:bottom w:val="single" w:sz="4" w:space="0" w:color="A6A6A6"/>
-              <w:left w:val="single" w:sz="4" w:space="0" w:color="A6A6A6"/>
-              <w:right w:val="single" w:sz="4" w:space="0" w:color="A6A6A6"/>
-            </w:tcBorders>
-            <w:vAlign w:val="center"/>
-          </w:tcPr>
-          <w:p>
-            <w:pPr>
-              <w:jc w:val="left"/>
-            </w:pPr>
-            <w:r/>
-            <w:r>
-              <w:rPr>
-                <w:rFonts w:ascii="Calibri" w:hAnsi="Calibri"/>
-                <w:b w:val="0"/>
-                <w:color w:val="333333"/>
-                <w:sz w:val="19"/>
-              </w:rPr>
+            <w:tcW w:type="dxa" w:w="1504"/>
+          </w:tcPr>
+          <w:p>
+            <w:r>
               <w:t>Lead Pentester</w:t>
             </w:r>
           </w:p>
         </w:tc>
         <w:tc>
           <w:tcPr>
-            <w:tcW w:type="dxa" w:w="1200"/>
-            <w:tcMar>
-              <w:top w:w="60" w:type="dxa"/>
-              <w:bottom w:w="60" w:type="dxa"/>
-              <w:left w:w="90" w:type="dxa"/>
-              <w:right w:w="90" w:type="dxa"/>
-            </w:tcMar>
-            <w:tcBorders>
-              <w:top w:val="single" w:sz="4" w:space="0" w:color="A6A6A6"/>
-              <w:bottom w:val="single" w:sz="4" w:space="0" w:color="A6A6A6"/>
-              <w:left w:val="single" w:sz="4" w:space="0" w:color="A6A6A6"/>
-              <w:right w:val="single" w:sz="4" w:space="0" w:color="A6A6A6"/>
-            </w:tcBorders>
-            <w:vAlign w:val="center"/>
-          </w:tcPr>
-          <w:p>
-            <w:pPr>
-              <w:jc w:val="center"/>
-            </w:pPr>
-            <w:r/>
-            <w:r>
-              <w:rPr>
-                <w:rFonts w:ascii="Calibri" w:hAnsi="Calibri"/>
-                <w:b w:val="0"/>
-                <w:color w:val="333333"/>
-                <w:sz w:val="19"/>
-              </w:rPr>
+            <w:tcW w:type="dxa" w:w="1504"/>
+          </w:tcPr>
+          <w:p>
+            <w:r>
               <w:t>90 Hari</w:t>
             </w:r>
           </w:p>
         </w:tc>
         <w:tc>
           <w:tcPr>
-            <w:tcW w:type="dxa" w:w="1200"/>
-            <w:tcMar>
-              <w:top w:w="60" w:type="dxa"/>
-              <w:bottom w:w="60" w:type="dxa"/>
-              <w:left w:w="90" w:type="dxa"/>
-              <w:right w:w="90" w:type="dxa"/>
-            </w:tcMar>
-            <w:tcBorders>
-              <w:top w:val="single" w:sz="4" w:space="0" w:color="A6A6A6"/>
-              <w:bottom w:val="single" w:sz="4" w:space="0" w:color="A6A6A6"/>
-              <w:left w:val="single" w:sz="4" w:space="0" w:color="A6A6A6"/>
-              <w:right w:val="single" w:sz="4" w:space="0" w:color="A6A6A6"/>
-            </w:tcBorders>
-            <w:vAlign w:val="center"/>
-          </w:tcPr>
-          <w:p>
-            <w:pPr>
-              <w:jc w:val="center"/>
-            </w:pPr>
-            <w:r/>
-            <w:r>
-              <w:rPr>
-                <w:rFonts w:ascii="Calibri" w:hAnsi="Calibri"/>
-                <w:b/>
-                <w:color w:val="1F3864"/>
-                <w:sz w:val="19"/>
-              </w:rPr>
+            <w:tcW w:type="dxa" w:w="1504"/>
+          </w:tcPr>
+          <w:p>
+            <w:r>
               <w:t>Open</w:t>
             </w:r>
           </w:p>
         </w:tc>
       </w:tr>
       <w:tr>
-        <w:trPr>
-          <w:cantSplit/>
-        </w:trPr>
-        <w:tc>
-          <w:tcPr>
-            <w:tcW w:type="dxa" w:w="1000"/>
-            <w:shd w:fill="F2F2F2"/>
-            <w:tcMar>
-              <w:top w:w="60" w:type="dxa"/>
-              <w:bottom w:w="60" w:type="dxa"/>
-              <w:left w:w="90" w:type="dxa"/>
-              <w:right w:w="90" w:type="dxa"/>
-            </w:tcMar>
-            <w:tcBorders>
-              <w:top w:val="single" w:sz="4" w:space="0" w:color="A6A6A6"/>
-              <w:bottom w:val="single" w:sz="4" w:space="0" w:color="A6A6A6"/>
-              <w:left w:val="single" w:sz="4" w:space="0" w:color="A6A6A6"/>
-              <w:right w:val="single" w:sz="4" w:space="0" w:color="A6A6A6"/>
-            </w:tcBorders>
-            <w:vAlign w:val="center"/>
-          </w:tcPr>
-          <w:p>
-            <w:pPr>
-              <w:jc w:val="center"/>
-            </w:pPr>
-            <w:r/>
-            <w:r>
-              <w:rPr>
-                <w:rFonts w:ascii="Calibri" w:hAnsi="Calibri"/>
-                <w:b/>
-                <w:color w:val="333333"/>
-                <w:sz w:val="19"/>
-              </w:rPr>
+        <w:tc>
+          <w:tcPr>
+            <w:tcW w:type="dxa" w:w="1504"/>
+          </w:tcPr>
+          <w:p>
+            <w:r>
               <w:t>NC-03</w:t>
             </w:r>
           </w:p>
         </w:tc>
         <w:tc>
           <w:tcPr>
-            <w:tcW w:type="dxa" w:w="3226"/>
-            <w:tcMar>
-              <w:top w:w="60" w:type="dxa"/>
-              <w:bottom w:w="60" w:type="dxa"/>
-              <w:left w:w="90" w:type="dxa"/>
-              <w:right w:w="90" w:type="dxa"/>
-            </w:tcMar>
-            <w:tcBorders>
-              <w:top w:val="single" w:sz="4" w:space="0" w:color="A6A6A6"/>
-              <w:bottom w:val="single" w:sz="4" w:space="0" w:color="A6A6A6"/>
-              <w:left w:val="single" w:sz="4" w:space="0" w:color="A6A6A6"/>
-              <w:right w:val="single" w:sz="4" w:space="0" w:color="A6A6A6"/>
-            </w:tcBorders>
-            <w:vAlign w:val="center"/>
-          </w:tcPr>
-          <w:p>
-            <w:pPr>
-              <w:jc w:val="left"/>
-            </w:pPr>
-            <w:r/>
-            <w:r>
-              <w:rPr>
-                <w:rFonts w:ascii="Calibri" w:hAnsi="Calibri"/>
-                <w:b w:val="0"/>
-                <w:color w:val="333333"/>
-                <w:sz w:val="19"/>
-              </w:rPr>
-              <w:t>Integrasi automated Threat Intelligence Feed (BSSN/OpenCTI) ke firewall perimeter belum aktif</w:t>
-            </w:r>
-          </w:p>
-        </w:tc>
-        <w:tc>
-          <w:tcPr>
-            <w:tcW w:type="dxa" w:w="1100"/>
-            <w:tcMar>
-              <w:top w:w="60" w:type="dxa"/>
-              <w:bottom w:w="60" w:type="dxa"/>
-              <w:left w:w="90" w:type="dxa"/>
-              <w:right w:w="90" w:type="dxa"/>
-            </w:tcMar>
-            <w:tcBorders>
-              <w:top w:val="single" w:sz="4" w:space="0" w:color="A6A6A6"/>
-              <w:bottom w:val="single" w:sz="4" w:space="0" w:color="A6A6A6"/>
-              <w:left w:val="single" w:sz="4" w:space="0" w:color="A6A6A6"/>
-              <w:right w:val="single" w:sz="4" w:space="0" w:color="A6A6A6"/>
-            </w:tcBorders>
-            <w:vAlign w:val="center"/>
-          </w:tcPr>
-          <w:p>
-            <w:pPr>
-              <w:jc w:val="center"/>
-            </w:pPr>
-            <w:r/>
-            <w:r>
-              <w:rPr>
-                <w:rFonts w:ascii="Calibri" w:hAnsi="Calibri"/>
-                <w:b/>
-                <w:color w:val="333333"/>
-                <w:sz w:val="19"/>
-              </w:rPr>
+            <w:tcW w:type="dxa" w:w="1504"/>
+          </w:tcPr>
+          <w:p>
+            <w:r>
+              <w:t>Integrasi automated Threat Intelligence Feed (BSSN/OpenCTI) ke firewall perimeter belum aktif [Item 40]</w:t>
+            </w:r>
+          </w:p>
+        </w:tc>
+        <w:tc>
+          <w:tcPr>
+            <w:tcW w:type="dxa" w:w="1504"/>
+          </w:tcPr>
+          <w:p>
+            <w:r>
               <w:t>Medium</w:t>
             </w:r>
           </w:p>
         </w:tc>
         <w:tc>
           <w:tcPr>
-            <w:tcW w:type="dxa" w:w="1300"/>
-            <w:tcMar>
-              <w:top w:w="60" w:type="dxa"/>
-              <w:bottom w:w="60" w:type="dxa"/>
-              <w:left w:w="90" w:type="dxa"/>
-              <w:right w:w="90" w:type="dxa"/>
-            </w:tcMar>
-            <w:tcBorders>
-              <w:top w:val="single" w:sz="4" w:space="0" w:color="A6A6A6"/>
-              <w:bottom w:val="single" w:sz="4" w:space="0" w:color="A6A6A6"/>
-              <w:left w:val="single" w:sz="4" w:space="0" w:color="A6A6A6"/>
-              <w:right w:val="single" w:sz="4" w:space="0" w:color="A6A6A6"/>
-            </w:tcBorders>
-            <w:vAlign w:val="center"/>
-          </w:tcPr>
-          <w:p>
-            <w:pPr>
-              <w:jc w:val="left"/>
-            </w:pPr>
-            <w:r/>
-            <w:r>
-              <w:rPr>
-                <w:rFonts w:ascii="Calibri" w:hAnsi="Calibri"/>
-                <w:b w:val="0"/>
-                <w:color w:val="333333"/>
-                <w:sz w:val="19"/>
-              </w:rPr>
+            <w:tcW w:type="dxa" w:w="1504"/>
+          </w:tcPr>
+          <w:p>
+            <w:r>
               <w:t>SOC Lead</w:t>
             </w:r>
           </w:p>
         </w:tc>
         <w:tc>
           <w:tcPr>
-            <w:tcW w:type="dxa" w:w="1200"/>
-            <w:tcMar>
-              <w:top w:w="60" w:type="dxa"/>
-              <w:bottom w:w="60" w:type="dxa"/>
-              <w:left w:w="90" w:type="dxa"/>
-              <w:right w:w="90" w:type="dxa"/>
-            </w:tcMar>
-            <w:tcBorders>
-              <w:top w:val="single" w:sz="4" w:space="0" w:color="A6A6A6"/>
-              <w:bottom w:val="single" w:sz="4" w:space="0" w:color="A6A6A6"/>
-              <w:left w:val="single" w:sz="4" w:space="0" w:color="A6A6A6"/>
-              <w:right w:val="single" w:sz="4" w:space="0" w:color="A6A6A6"/>
-            </w:tcBorders>
-            <w:vAlign w:val="center"/>
-          </w:tcPr>
-          <w:p>
-            <w:pPr>
-              <w:jc w:val="center"/>
-            </w:pPr>
-            <w:r/>
-            <w:r>
-              <w:rPr>
-                <w:rFonts w:ascii="Calibri" w:hAnsi="Calibri"/>
-                <w:b w:val="0"/>
-                <w:color w:val="333333"/>
-                <w:sz w:val="19"/>
-              </w:rPr>
+            <w:tcW w:type="dxa" w:w="1504"/>
+          </w:tcPr>
+          <w:p>
+            <w:r>
               <w:t>60 Hari</w:t>
             </w:r>
           </w:p>
         </w:tc>
         <w:tc>
           <w:tcPr>
-            <w:tcW w:type="dxa" w:w="1200"/>
-            <w:tcMar>
-              <w:top w:w="60" w:type="dxa"/>
-              <w:bottom w:w="60" w:type="dxa"/>
-              <w:left w:w="90" w:type="dxa"/>
-              <w:right w:w="90" w:type="dxa"/>
-            </w:tcMar>
-            <w:tcBorders>
-              <w:top w:val="single" w:sz="4" w:space="0" w:color="A6A6A6"/>
-              <w:bottom w:val="single" w:sz="4" w:space="0" w:color="A6A6A6"/>
-              <w:left w:val="single" w:sz="4" w:space="0" w:color="A6A6A6"/>
-              <w:right w:val="single" w:sz="4" w:space="0" w:color="A6A6A6"/>
-            </w:tcBorders>
-            <w:vAlign w:val="center"/>
-          </w:tcPr>
-          <w:p>
-            <w:pPr>
-              <w:jc w:val="center"/>
-            </w:pPr>
-            <w:r/>
-            <w:r>
-              <w:rPr>
-                <w:rFonts w:ascii="Calibri" w:hAnsi="Calibri"/>
-                <w:b/>
-                <w:color w:val="1F3864"/>
-                <w:sz w:val="19"/>
-              </w:rPr>
+            <w:tcW w:type="dxa" w:w="1504"/>
+          </w:tcPr>
+          <w:p>
+            <w:r>
               <w:t>Open</w:t>
             </w:r>
           </w:p>
         </w:tc>
       </w:tr>
       <w:tr>
-        <w:trPr>
-          <w:cantSplit/>
-        </w:trPr>
-        <w:tc>
-          <w:tcPr>
-            <w:tcW w:type="dxa" w:w="1000"/>
-            <w:shd w:fill="F2F2F2"/>
-            <w:tcMar>
-              <w:top w:w="60" w:type="dxa"/>
-              <w:bottom w:w="60" w:type="dxa"/>
-              <w:left w:w="90" w:type="dxa"/>
-              <w:right w:w="90" w:type="dxa"/>
-            </w:tcMar>
-            <w:tcBorders>
-              <w:top w:val="single" w:sz="4" w:space="0" w:color="A6A6A6"/>
-              <w:bottom w:val="single" w:sz="4" w:space="0" w:color="A6A6A6"/>
-              <w:left w:val="single" w:sz="4" w:space="0" w:color="A6A6A6"/>
-              <w:right w:val="single" w:sz="4" w:space="0" w:color="A6A6A6"/>
-            </w:tcBorders>
-            <w:vAlign w:val="center"/>
-          </w:tcPr>
-          <w:p>
-            <w:pPr>
-              <w:jc w:val="center"/>
-            </w:pPr>
-            <w:r/>
-            <w:r>
-              <w:rPr>
-                <w:rFonts w:ascii="Calibri" w:hAnsi="Calibri"/>
-                <w:b/>
-                <w:color w:val="333333"/>
-                <w:sz w:val="19"/>
-              </w:rPr>
+        <w:tc>
+          <w:tcPr>
+            <w:tcW w:type="dxa" w:w="1504"/>
+          </w:tcPr>
+          <w:p>
+            <w:r>
               <w:t>NC-04</w:t>
             </w:r>
           </w:p>
         </w:tc>
         <w:tc>
           <w:tcPr>
-            <w:tcW w:type="dxa" w:w="3226"/>
-            <w:tcMar>
-              <w:top w:w="60" w:type="dxa"/>
-              <w:bottom w:w="60" w:type="dxa"/>
-              <w:left w:w="90" w:type="dxa"/>
-              <w:right w:w="90" w:type="dxa"/>
-            </w:tcMar>
-            <w:tcBorders>
-              <w:top w:val="single" w:sz="4" w:space="0" w:color="A6A6A6"/>
-              <w:bottom w:val="single" w:sz="4" w:space="0" w:color="A6A6A6"/>
-              <w:left w:val="single" w:sz="4" w:space="0" w:color="A6A6A6"/>
-              <w:right w:val="single" w:sz="4" w:space="0" w:color="A6A6A6"/>
-            </w:tcBorders>
-            <w:vAlign w:val="center"/>
-          </w:tcPr>
-          <w:p>
-            <w:pPr>
-              <w:jc w:val="left"/>
-            </w:pPr>
-            <w:r/>
-            <w:r>
-              <w:rPr>
-                <w:rFonts w:ascii="Calibri" w:hAnsi="Calibri"/>
-                <w:b w:val="0"/>
-                <w:color w:val="333333"/>
-                <w:sz w:val="19"/>
-              </w:rPr>
-              <w:t>Toolkit akuisisi memori RAM forensik (LiME/Volatility) belum terpasang pada VPS produksi</w:t>
-            </w:r>
-          </w:p>
-        </w:tc>
-        <w:tc>
-          <w:tcPr>
-            <w:tcW w:type="dxa" w:w="1100"/>
-            <w:tcMar>
-              <w:top w:w="60" w:type="dxa"/>
-              <w:bottom w:w="60" w:type="dxa"/>
-              <w:left w:w="90" w:type="dxa"/>
-              <w:right w:w="90" w:type="dxa"/>
-            </w:tcMar>
-            <w:tcBorders>
-              <w:top w:val="single" w:sz="4" w:space="0" w:color="A6A6A6"/>
-              <w:bottom w:val="single" w:sz="4" w:space="0" w:color="A6A6A6"/>
-              <w:left w:val="single" w:sz="4" w:space="0" w:color="A6A6A6"/>
-              <w:right w:val="single" w:sz="4" w:space="0" w:color="A6A6A6"/>
-            </w:tcBorders>
-            <w:vAlign w:val="center"/>
-          </w:tcPr>
-          <w:p>
-            <w:pPr>
-              <w:jc w:val="center"/>
-            </w:pPr>
-            <w:r/>
-            <w:r>
-              <w:rPr>
-                <w:rFonts w:ascii="Calibri" w:hAnsi="Calibri"/>
-                <w:b/>
-                <w:color w:val="333333"/>
-                <w:sz w:val="19"/>
-              </w:rPr>
+            <w:tcW w:type="dxa" w:w="1504"/>
+          </w:tcPr>
+          <w:p>
+            <w:r>
+              <w:t>Toolkit akuisisi memori RAM forensik (LiME/Volatility) belum terpasang pada VPS produksi [Item 17]</w:t>
+            </w:r>
+          </w:p>
+        </w:tc>
+        <w:tc>
+          <w:tcPr>
+            <w:tcW w:type="dxa" w:w="1504"/>
+          </w:tcPr>
+          <w:p>
+            <w:r>
               <w:t>Medium</w:t>
             </w:r>
           </w:p>
         </w:tc>
         <w:tc>
           <w:tcPr>
-            <w:tcW w:type="dxa" w:w="1300"/>
-            <w:tcMar>
-              <w:top w:w="60" w:type="dxa"/>
-              <w:bottom w:w="60" w:type="dxa"/>
-              <w:left w:w="90" w:type="dxa"/>
-              <w:right w:w="90" w:type="dxa"/>
-            </w:tcMar>
-            <w:tcBorders>
-              <w:top w:val="single" w:sz="4" w:space="0" w:color="A6A6A6"/>
-              <w:bottom w:val="single" w:sz="4" w:space="0" w:color="A6A6A6"/>
-              <w:left w:val="single" w:sz="4" w:space="0" w:color="A6A6A6"/>
-              <w:right w:val="single" w:sz="4" w:space="0" w:color="A6A6A6"/>
-            </w:tcBorders>
-            <w:vAlign w:val="center"/>
-          </w:tcPr>
-          <w:p>
-            <w:pPr>
-              <w:jc w:val="left"/>
-            </w:pPr>
-            <w:r/>
-            <w:r>
-              <w:rPr>
-                <w:rFonts w:ascii="Calibri" w:hAnsi="Calibri"/>
-                <w:b w:val="0"/>
-                <w:color w:val="333333"/>
-                <w:sz w:val="19"/>
-              </w:rPr>
+            <w:tcW w:type="dxa" w:w="1504"/>
+          </w:tcPr>
+          <w:p>
+            <w:r>
               <w:t>DevOps Lead</w:t>
             </w:r>
           </w:p>
         </w:tc>
         <w:tc>
           <w:tcPr>
-            <w:tcW w:type="dxa" w:w="1200"/>
-            <w:tcMar>
-              <w:top w:w="60" w:type="dxa"/>
-              <w:bottom w:w="60" w:type="dxa"/>
-              <w:left w:w="90" w:type="dxa"/>
-              <w:right w:w="90" w:type="dxa"/>
-            </w:tcMar>
-            <w:tcBorders>
-              <w:top w:val="single" w:sz="4" w:space="0" w:color="A6A6A6"/>
-              <w:bottom w:val="single" w:sz="4" w:space="0" w:color="A6A6A6"/>
-              <w:left w:val="single" w:sz="4" w:space="0" w:color="A6A6A6"/>
-              <w:right w:val="single" w:sz="4" w:space="0" w:color="A6A6A6"/>
-            </w:tcBorders>
-            <w:vAlign w:val="center"/>
-          </w:tcPr>
-          <w:p>
-            <w:pPr>
-              <w:jc w:val="center"/>
-            </w:pPr>
-            <w:r/>
-            <w:r>
-              <w:rPr>
-                <w:rFonts w:ascii="Calibri" w:hAnsi="Calibri"/>
-                <w:b w:val="0"/>
-                <w:color w:val="333333"/>
-                <w:sz w:val="19"/>
-              </w:rPr>
+            <w:tcW w:type="dxa" w:w="1504"/>
+          </w:tcPr>
+          <w:p>
+            <w:r>
               <w:t>30 Hari</w:t>
             </w:r>
           </w:p>
         </w:tc>
         <w:tc>
           <w:tcPr>
-            <w:tcW w:type="dxa" w:w="1200"/>
-            <w:tcMar>
-              <w:top w:w="60" w:type="dxa"/>
-              <w:bottom w:w="60" w:type="dxa"/>
-              <w:left w:w="90" w:type="dxa"/>
-              <w:right w:w="90" w:type="dxa"/>
-            </w:tcMar>
-            <w:tcBorders>
-              <w:top w:val="single" w:sz="4" w:space="0" w:color="A6A6A6"/>
-              <w:bottom w:val="single" w:sz="4" w:space="0" w:color="A6A6A6"/>
-              <w:left w:val="single" w:sz="4" w:space="0" w:color="A6A6A6"/>
-              <w:right w:val="single" w:sz="4" w:space="0" w:color="A6A6A6"/>
-            </w:tcBorders>
-            <w:vAlign w:val="center"/>
-          </w:tcPr>
-          <w:p>
-            <w:pPr>
-              <w:jc w:val="center"/>
-            </w:pPr>
-            <w:r/>
-            <w:r>
-              <w:rPr>
-                <w:rFonts w:ascii="Calibri" w:hAnsi="Calibri"/>
-                <w:b/>
-                <w:color w:val="1F3864"/>
-                <w:sz w:val="19"/>
-              </w:rPr>
+            <w:tcW w:type="dxa" w:w="1504"/>
+          </w:tcPr>
+          <w:p>
+            <w:r>
+              <w:t>Open</w:t>
+            </w:r>
+          </w:p>
+        </w:tc>
+      </w:tr>
+      <w:tr>
+        <w:tc>
+          <w:tcPr>
+            <w:tcW w:type="dxa" w:w="1504"/>
+          </w:tcPr>
+          <w:p>
+            <w:r>
+              <w:t>NC-05</w:t>
+            </w:r>
+          </w:p>
+        </w:tc>
+        <w:tc>
+          <w:tcPr>
+            <w:tcW w:type="dxa" w:w="1504"/>
+          </w:tcPr>
+          <w:p>
+            <w:r>
+              <w:t>Integrasi otomatis pencatatan temuan bug bounty ke Corporate Risk Register belum terhubung [Item 10]</w:t>
+            </w:r>
+          </w:p>
+        </w:tc>
+        <w:tc>
+          <w:tcPr>
+            <w:tcW w:type="dxa" w:w="1504"/>
+          </w:tcPr>
+          <w:p>
+            <w:r>
+              <w:t>Low</w:t>
+            </w:r>
+          </w:p>
+        </w:tc>
+        <w:tc>
+          <w:tcPr>
+            <w:tcW w:type="dxa" w:w="1504"/>
+          </w:tcPr>
+          <w:p>
+            <w:r>
+              <w:t>Risk Officer</w:t>
+            </w:r>
+          </w:p>
+        </w:tc>
+        <w:tc>
+          <w:tcPr>
+            <w:tcW w:type="dxa" w:w="1504"/>
+          </w:tcPr>
+          <w:p>
+            <w:r>
+              <w:t>60 Hari</w:t>
+            </w:r>
+          </w:p>
+        </w:tc>
+        <w:tc>
+          <w:tcPr>
+            <w:tcW w:type="dxa" w:w="1504"/>
+          </w:tcPr>
+          <w:p>
+            <w:r>
+              <w:t>Open</w:t>
+            </w:r>
+          </w:p>
+        </w:tc>
+      </w:tr>
+      <w:tr>
+        <w:tc>
+          <w:tcPr>
+            <w:tcW w:type="dxa" w:w="1504"/>
+          </w:tcPr>
+          <w:p>
+            <w:r>
+              <w:t>NC-06</w:t>
+            </w:r>
+          </w:p>
+        </w:tc>
+        <w:tc>
+          <w:tcPr>
+            <w:tcW w:type="dxa" w:w="1504"/>
+          </w:tcPr>
+          <w:p>
+            <w:r>
+              <w:t>Pelatihan formal analisis forensik digital dan sertifikasi penanganan insiden bagi tim SOC/IR belum terlaksana [Item 23]</w:t>
+            </w:r>
+          </w:p>
+        </w:tc>
+        <w:tc>
+          <w:tcPr>
+            <w:tcW w:type="dxa" w:w="1504"/>
+          </w:tcPr>
+          <w:p>
+            <w:r>
+              <w:t>Medium</w:t>
+            </w:r>
+          </w:p>
+        </w:tc>
+        <w:tc>
+          <w:tcPr>
+            <w:tcW w:type="dxa" w:w="1504"/>
+          </w:tcPr>
+          <w:p>
+            <w:r>
+              <w:t>HR / Security Lead</w:t>
+            </w:r>
+          </w:p>
+        </w:tc>
+        <w:tc>
+          <w:tcPr>
+            <w:tcW w:type="dxa" w:w="1504"/>
+          </w:tcPr>
+          <w:p>
+            <w:r>
+              <w:t>90 Hari</w:t>
+            </w:r>
+          </w:p>
+        </w:tc>
+        <w:tc>
+          <w:tcPr>
+            <w:tcW w:type="dxa" w:w="1504"/>
+          </w:tcPr>
+          <w:p>
+            <w:r>
+              <w:t>Open</w:t>
+            </w:r>
+          </w:p>
+        </w:tc>
+      </w:tr>
+      <w:tr>
+        <w:tc>
+          <w:tcPr>
+            <w:tcW w:type="dxa" w:w="1504"/>
+          </w:tcPr>
+          <w:p>
+            <w:r>
+              <w:t>NC-07</w:t>
+            </w:r>
+          </w:p>
+        </w:tc>
+        <w:tc>
+          <w:tcPr>
+            <w:tcW w:type="dxa" w:w="1504"/>
+          </w:tcPr>
+          <w:p>
+            <w:r>
+              <w:t>Sistem Data Loss Prevention (DLP) otomatis berbasis inspeksi konten belum aktif di API Gateway [Item 57]</w:t>
+            </w:r>
+          </w:p>
+        </w:tc>
+        <w:tc>
+          <w:tcPr>
+            <w:tcW w:type="dxa" w:w="1504"/>
+          </w:tcPr>
+          <w:p>
+            <w:r>
+              <w:t>High</w:t>
+            </w:r>
+          </w:p>
+        </w:tc>
+        <w:tc>
+          <w:tcPr>
+            <w:tcW w:type="dxa" w:w="1504"/>
+          </w:tcPr>
+          <w:p>
+            <w:r>
+              <w:t>Security Architect</w:t>
+            </w:r>
+          </w:p>
+        </w:tc>
+        <w:tc>
+          <w:tcPr>
+            <w:tcW w:type="dxa" w:w="1504"/>
+          </w:tcPr>
+          <w:p>
+            <w:r>
+              <w:t>60 Hari</w:t>
+            </w:r>
+          </w:p>
+        </w:tc>
+        <w:tc>
+          <w:tcPr>
+            <w:tcW w:type="dxa" w:w="1504"/>
+          </w:tcPr>
+          <w:p>
+            <w:r>
               <w:t>Open</w:t>
             </w:r>
           </w:p>
@@ -21505,17 +20565,7 @@
             <w:vAlign w:val="center"/>
           </w:tcPr>
           <w:p>
-            <w:pPr>
-              <w:jc w:val="left"/>
-            </w:pPr>
-            <w:r/>
-            <w:r>
-              <w:rPr>
-                <w:rFonts w:ascii="Calibri" w:hAnsi="Calibri"/>
-                <w:b w:val="0"/>
-                <w:color w:val="333333"/>
-                <w:sz w:val="19"/>
-              </w:rPr>
+            <w:r>
               <w:t>Domain 1: Bug Bounty &amp; Vulnerability Disclosure</w:t>
             </w:r>
           </w:p>
@@ -21538,17 +20588,7 @@
             <w:vAlign w:val="center"/>
           </w:tcPr>
           <w:p>
-            <w:pPr>
-              <w:jc w:val="center"/>
-            </w:pPr>
-            <w:r/>
-            <w:r>
-              <w:rPr>
-                <w:rFonts w:ascii="Calibri" w:hAnsi="Calibri"/>
-                <w:b/>
-                <w:color w:val="333333"/>
-                <w:sz w:val="19"/>
-              </w:rPr>
+            <w:r>
               <w:t>12</w:t>
             </w:r>
           </w:p>
@@ -21571,17 +20611,7 @@
             <w:vAlign w:val="center"/>
           </w:tcPr>
           <w:p>
-            <w:pPr>
-              <w:jc w:val="center"/>
-            </w:pPr>
-            <w:r/>
-            <w:r>
-              <w:rPr>
-                <w:rFonts w:ascii="Calibri" w:hAnsi="Calibri"/>
-                <w:b/>
-                <w:color w:val="27AE60"/>
-                <w:sz w:val="19"/>
-              </w:rPr>
+            <w:r>
               <w:t>0</w:t>
             </w:r>
           </w:p>
@@ -21604,18 +20634,8 @@
             <w:vAlign w:val="center"/>
           </w:tcPr>
           <w:p>
-            <w:pPr>
-              <w:jc w:val="center"/>
-            </w:pPr>
-            <w:r/>
-            <w:r>
-              <w:rPr>
-                <w:rFonts w:ascii="Calibri" w:hAnsi="Calibri"/>
-                <w:b w:val="0"/>
-                <w:color w:val="333333"/>
-                <w:sz w:val="19"/>
-              </w:rPr>
-              <w:t>0</w:t>
+            <w:r>
+              <w:t>2</w:t>
             </w:r>
           </w:p>
         </w:tc>
@@ -21637,18 +20657,8 @@
             <w:vAlign w:val="center"/>
           </w:tcPr>
           <w:p>
-            <w:pPr>
-              <w:jc w:val="center"/>
-            </w:pPr>
-            <w:r/>
-            <w:r>
-              <w:rPr>
-                <w:rFonts w:ascii="Calibri" w:hAnsi="Calibri"/>
-                <w:b w:val="0"/>
-                <w:color w:val="333333"/>
-                <w:sz w:val="19"/>
-              </w:rPr>
-              <w:t>0</w:t>
+            <w:r>
+              <w:t>10</w:t>
             </w:r>
           </w:p>
         </w:tc>
@@ -21670,17 +20680,7 @@
             <w:vAlign w:val="center"/>
           </w:tcPr>
           <w:p>
-            <w:pPr>
-              <w:jc w:val="center"/>
-            </w:pPr>
-            <w:r/>
-            <w:r>
-              <w:rPr>
-                <w:rFonts w:ascii="Calibri" w:hAnsi="Calibri"/>
-                <w:b w:val="0"/>
-                <w:color w:val="333333"/>
-                <w:sz w:val="19"/>
-              </w:rPr>
+            <w:r>
               <w:t>0</w:t>
             </w:r>
           </w:p>
@@ -21709,17 +20709,7 @@
             <w:vAlign w:val="center"/>
           </w:tcPr>
           <w:p>
-            <w:pPr>
-              <w:jc w:val="left"/>
-            </w:pPr>
-            <w:r/>
-            <w:r>
-              <w:rPr>
-                <w:rFonts w:ascii="Calibri" w:hAnsi="Calibri"/>
-                <w:b w:val="0"/>
-                <w:color w:val="333333"/>
-                <w:sz w:val="19"/>
-              </w:rPr>
+            <w:r>
               <w:t>Domain 2: Forensic Readiness &amp; Chain of Custody</w:t>
             </w:r>
           </w:p>
@@ -21742,17 +20732,7 @@
             <w:vAlign w:val="center"/>
           </w:tcPr>
           <w:p>
-            <w:pPr>
-              <w:jc w:val="center"/>
-            </w:pPr>
-            <w:r/>
-            <w:r>
-              <w:rPr>
-                <w:rFonts w:ascii="Calibri" w:hAnsi="Calibri"/>
-                <w:b/>
-                <w:color w:val="333333"/>
-                <w:sz w:val="19"/>
-              </w:rPr>
+            <w:r>
               <w:t>12</w:t>
             </w:r>
           </w:p>
@@ -21775,17 +20755,7 @@
             <w:vAlign w:val="center"/>
           </w:tcPr>
           <w:p>
-            <w:pPr>
-              <w:jc w:val="center"/>
-            </w:pPr>
-            <w:r/>
-            <w:r>
-              <w:rPr>
-                <w:rFonts w:ascii="Calibri" w:hAnsi="Calibri"/>
-                <w:b/>
-                <w:color w:val="27AE60"/>
-                <w:sz w:val="19"/>
-              </w:rPr>
+            <w:r>
               <w:t>7</w:t>
             </w:r>
           </w:p>
@@ -21808,18 +20778,8 @@
             <w:vAlign w:val="center"/>
           </w:tcPr>
           <w:p>
-            <w:pPr>
-              <w:jc w:val="center"/>
-            </w:pPr>
-            <w:r/>
-            <w:r>
-              <w:rPr>
-                <w:rFonts w:ascii="Calibri" w:hAnsi="Calibri"/>
-                <w:b w:val="0"/>
-                <w:color w:val="333333"/>
-                <w:sz w:val="19"/>
-              </w:rPr>
-              <w:t>0</w:t>
+            <w:r>
+              <w:t>2</w:t>
             </w:r>
           </w:p>
         </w:tc>
@@ -21841,18 +20801,8 @@
             <w:vAlign w:val="center"/>
           </w:tcPr>
           <w:p>
-            <w:pPr>
-              <w:jc w:val="center"/>
-            </w:pPr>
-            <w:r/>
-            <w:r>
-              <w:rPr>
-                <w:rFonts w:ascii="Calibri" w:hAnsi="Calibri"/>
-                <w:b w:val="0"/>
-                <w:color w:val="333333"/>
-                <w:sz w:val="19"/>
-              </w:rPr>
-              <w:t>0</w:t>
+            <w:r>
+              <w:t>2</w:t>
             </w:r>
           </w:p>
         </w:tc>
@@ -21874,18 +20824,8 @@
             <w:vAlign w:val="center"/>
           </w:tcPr>
           <w:p>
-            <w:pPr>
-              <w:jc w:val="center"/>
-            </w:pPr>
-            <w:r/>
-            <w:r>
-              <w:rPr>
-                <w:rFonts w:ascii="Calibri" w:hAnsi="Calibri"/>
-                <w:b w:val="0"/>
-                <w:color w:val="333333"/>
-                <w:sz w:val="19"/>
-              </w:rPr>
-              <w:t>0</w:t>
+            <w:r>
+              <w:t>1</w:t>
             </w:r>
           </w:p>
         </w:tc>
@@ -21913,17 +20853,7 @@
             <w:vAlign w:val="center"/>
           </w:tcPr>
           <w:p>
-            <w:pPr>
-              <w:jc w:val="left"/>
-            </w:pPr>
-            <w:r/>
-            <w:r>
-              <w:rPr>
-                <w:rFonts w:ascii="Calibri" w:hAnsi="Calibri"/>
-                <w:b w:val="0"/>
-                <w:color w:val="333333"/>
-                <w:sz w:val="19"/>
-              </w:rPr>
+            <w:r>
               <w:t>Domain 3: Red Team &amp; Purple Team Testing</w:t>
             </w:r>
           </w:p>
@@ -21946,17 +20876,7 @@
             <w:vAlign w:val="center"/>
           </w:tcPr>
           <w:p>
-            <w:pPr>
-              <w:jc w:val="center"/>
-            </w:pPr>
-            <w:r/>
-            <w:r>
-              <w:rPr>
-                <w:rFonts w:ascii="Calibri" w:hAnsi="Calibri"/>
-                <w:b/>
-                <w:color w:val="333333"/>
-                <w:sz w:val="19"/>
-              </w:rPr>
+            <w:r>
               <w:t>12</w:t>
             </w:r>
           </w:p>
@@ -21979,17 +20899,7 @@
             <w:vAlign w:val="center"/>
           </w:tcPr>
           <w:p>
-            <w:pPr>
-              <w:jc w:val="center"/>
-            </w:pPr>
-            <w:r/>
-            <w:r>
-              <w:rPr>
-                <w:rFonts w:ascii="Calibri" w:hAnsi="Calibri"/>
-                <w:b/>
-                <w:color w:val="27AE60"/>
-                <w:sz w:val="19"/>
-              </w:rPr>
+            <w:r>
               <w:t>6</w:t>
             </w:r>
           </w:p>
@@ -22012,18 +20922,8 @@
             <w:vAlign w:val="center"/>
           </w:tcPr>
           <w:p>
-            <w:pPr>
-              <w:jc w:val="center"/>
-            </w:pPr>
-            <w:r/>
-            <w:r>
-              <w:rPr>
-                <w:rFonts w:ascii="Calibri" w:hAnsi="Calibri"/>
-                <w:b w:val="0"/>
-                <w:color w:val="333333"/>
-                <w:sz w:val="19"/>
-              </w:rPr>
-              <w:t>0</w:t>
+            <w:r>
+              <w:t>1</w:t>
             </w:r>
           </w:p>
         </w:tc>
@@ -22045,18 +20945,8 @@
             <w:vAlign w:val="center"/>
           </w:tcPr>
           <w:p>
-            <w:pPr>
-              <w:jc w:val="center"/>
-            </w:pPr>
-            <w:r/>
-            <w:r>
-              <w:rPr>
-                <w:rFonts w:ascii="Calibri" w:hAnsi="Calibri"/>
-                <w:b w:val="0"/>
-                <w:color w:val="333333"/>
-                <w:sz w:val="19"/>
-              </w:rPr>
-              <w:t>0</w:t>
+            <w:r>
+              <w:t>5</w:t>
             </w:r>
           </w:p>
         </w:tc>
@@ -22078,17 +20968,7 @@
             <w:vAlign w:val="center"/>
           </w:tcPr>
           <w:p>
-            <w:pPr>
-              <w:jc w:val="center"/>
-            </w:pPr>
-            <w:r/>
-            <w:r>
-              <w:rPr>
-                <w:rFonts w:ascii="Calibri" w:hAnsi="Calibri"/>
-                <w:b w:val="0"/>
-                <w:color w:val="333333"/>
-                <w:sz w:val="19"/>
-              </w:rPr>
+            <w:r>
               <w:t>0</w:t>
             </w:r>
           </w:p>
@@ -22117,17 +20997,7 @@
             <w:vAlign w:val="center"/>
           </w:tcPr>
           <w:p>
-            <w:pPr>
-              <w:jc w:val="left"/>
-            </w:pPr>
-            <w:r/>
-            <w:r>
-              <w:rPr>
-                <w:rFonts w:ascii="Calibri" w:hAnsi="Calibri"/>
-                <w:b w:val="0"/>
-                <w:color w:val="333333"/>
-                <w:sz w:val="19"/>
-              </w:rPr>
+            <w:r>
               <w:t>Domain 4: Cyber Threat Intelligence &amp; Sharing</w:t>
             </w:r>
           </w:p>
@@ -22150,17 +21020,7 @@
             <w:vAlign w:val="center"/>
           </w:tcPr>
           <w:p>
-            <w:pPr>
-              <w:jc w:val="center"/>
-            </w:pPr>
-            <w:r/>
-            <w:r>
-              <w:rPr>
-                <w:rFonts w:ascii="Calibri" w:hAnsi="Calibri"/>
-                <w:b/>
-                <w:color w:val="333333"/>
-                <w:sz w:val="19"/>
-              </w:rPr>
+            <w:r>
               <w:t>12</w:t>
             </w:r>
           </w:p>
@@ -22183,17 +21043,7 @@
             <w:vAlign w:val="center"/>
           </w:tcPr>
           <w:p>
-            <w:pPr>
-              <w:jc w:val="center"/>
-            </w:pPr>
-            <w:r/>
-            <w:r>
-              <w:rPr>
-                <w:rFonts w:ascii="Calibri" w:hAnsi="Calibri"/>
-                <w:b/>
-                <w:color w:val="27AE60"/>
-                <w:sz w:val="19"/>
-              </w:rPr>
+            <w:r>
               <w:t>7</w:t>
             </w:r>
           </w:p>
@@ -22216,18 +21066,8 @@
             <w:vAlign w:val="center"/>
           </w:tcPr>
           <w:p>
-            <w:pPr>
-              <w:jc w:val="center"/>
-            </w:pPr>
-            <w:r/>
-            <w:r>
-              <w:rPr>
-                <w:rFonts w:ascii="Calibri" w:hAnsi="Calibri"/>
-                <w:b w:val="0"/>
-                <w:color w:val="333333"/>
-                <w:sz w:val="19"/>
-              </w:rPr>
-              <w:t>0</w:t>
+            <w:r>
+              <w:t>1</w:t>
             </w:r>
           </w:p>
         </w:tc>
@@ -22249,18 +21089,8 @@
             <w:vAlign w:val="center"/>
           </w:tcPr>
           <w:p>
-            <w:pPr>
-              <w:jc w:val="center"/>
-            </w:pPr>
-            <w:r/>
-            <w:r>
-              <w:rPr>
-                <w:rFonts w:ascii="Calibri" w:hAnsi="Calibri"/>
-                <w:b w:val="0"/>
-                <w:color w:val="333333"/>
-                <w:sz w:val="19"/>
-              </w:rPr>
-              <w:t>0</w:t>
+            <w:r>
+              <w:t>4</w:t>
             </w:r>
           </w:p>
         </w:tc>
@@ -22282,17 +21112,7 @@
             <w:vAlign w:val="center"/>
           </w:tcPr>
           <w:p>
-            <w:pPr>
-              <w:jc w:val="center"/>
-            </w:pPr>
-            <w:r/>
-            <w:r>
-              <w:rPr>
-                <w:rFonts w:ascii="Calibri" w:hAnsi="Calibri"/>
-                <w:b w:val="0"/>
-                <w:color w:val="333333"/>
-                <w:sz w:val="19"/>
-              </w:rPr>
+            <w:r>
               <w:t>0</w:t>
             </w:r>
           </w:p>
@@ -22321,17 +21141,7 @@
             <w:vAlign w:val="center"/>
           </w:tcPr>
           <w:p>
-            <w:pPr>
-              <w:jc w:val="left"/>
-            </w:pPr>
-            <w:r/>
-            <w:r>
-              <w:rPr>
-                <w:rFonts w:ascii="Calibri" w:hAnsi="Calibri"/>
-                <w:b w:val="0"/>
-                <w:color w:val="333333"/>
-                <w:sz w:val="19"/>
-              </w:rPr>
+            <w:r>
               <w:t>Domain 5: Zero Trust Architecture</w:t>
             </w:r>
           </w:p>
@@ -22354,17 +21164,7 @@
             <w:vAlign w:val="center"/>
           </w:tcPr>
           <w:p>
-            <w:pPr>
-              <w:jc w:val="center"/>
-            </w:pPr>
-            <w:r/>
-            <w:r>
-              <w:rPr>
-                <w:rFonts w:ascii="Calibri" w:hAnsi="Calibri"/>
-                <w:b/>
-                <w:color w:val="333333"/>
-                <w:sz w:val="19"/>
-              </w:rPr>
+            <w:r>
               <w:t>12</w:t>
             </w:r>
           </w:p>
@@ -22387,17 +21187,7 @@
             <w:vAlign w:val="center"/>
           </w:tcPr>
           <w:p>
-            <w:pPr>
-              <w:jc w:val="center"/>
-            </w:pPr>
-            <w:r/>
-            <w:r>
-              <w:rPr>
-                <w:rFonts w:ascii="Calibri" w:hAnsi="Calibri"/>
-                <w:b/>
-                <w:color w:val="27AE60"/>
-                <w:sz w:val="19"/>
-              </w:rPr>
+            <w:r>
               <w:t>9</w:t>
             </w:r>
           </w:p>
@@ -22420,18 +21210,8 @@
             <w:vAlign w:val="center"/>
           </w:tcPr>
           <w:p>
-            <w:pPr>
-              <w:jc w:val="center"/>
-            </w:pPr>
-            <w:r/>
-            <w:r>
-              <w:rPr>
-                <w:rFonts w:ascii="Calibri" w:hAnsi="Calibri"/>
-                <w:b w:val="0"/>
-                <w:color w:val="333333"/>
-                <w:sz w:val="19"/>
-              </w:rPr>
-              <w:t>0</w:t>
+            <w:r>
+              <w:t>1</w:t>
             </w:r>
           </w:p>
         </w:tc>
@@ -22453,18 +21233,8 @@
             <w:vAlign w:val="center"/>
           </w:tcPr>
           <w:p>
-            <w:pPr>
-              <w:jc w:val="center"/>
-            </w:pPr>
-            <w:r/>
-            <w:r>
-              <w:rPr>
-                <w:rFonts w:ascii="Calibri" w:hAnsi="Calibri"/>
-                <w:b w:val="0"/>
-                <w:color w:val="333333"/>
-                <w:sz w:val="19"/>
-              </w:rPr>
-              <w:t>0</w:t>
+            <w:r>
+              <w:t>2</w:t>
             </w:r>
           </w:p>
         </w:tc>
@@ -22486,17 +21256,7 @@
             <w:vAlign w:val="center"/>
           </w:tcPr>
           <w:p>
-            <w:pPr>
-              <w:jc w:val="center"/>
-            </w:pPr>
-            <w:r/>
-            <w:r>
-              <w:rPr>
-                <w:rFonts w:ascii="Calibri" w:hAnsi="Calibri"/>
-                <w:b w:val="0"/>
-                <w:color w:val="333333"/>
-                <w:sz w:val="19"/>
-              </w:rPr>
+            <w:r>
               <w:t>0</w:t>
             </w:r>
           </w:p>
@@ -22525,17 +21285,7 @@
             <w:vAlign w:val="center"/>
           </w:tcPr>
           <w:p>
-            <w:pPr>
-              <w:jc w:val="left"/>
-            </w:pPr>
-            <w:r/>
-            <w:r>
-              <w:rPr>
-                <w:rFonts w:ascii="Calibri" w:hAnsi="Calibri"/>
-                <w:b/>
-                <w:color w:val="333333"/>
-                <w:sz w:val="19"/>
-              </w:rPr>
+            <w:r>
               <w:t>TOTAL ADVANCED SECURITY CONTROLS</w:t>
             </w:r>
           </w:p>
@@ -22558,17 +21308,7 @@
             <w:vAlign w:val="center"/>
           </w:tcPr>
           <w:p>
-            <w:pPr>
-              <w:jc w:val="center"/>
-            </w:pPr>
-            <w:r/>
-            <w:r>
-              <w:rPr>
-                <w:rFonts w:ascii="Calibri" w:hAnsi="Calibri"/>
-                <w:b/>
-                <w:color w:val="333333"/>
-                <w:sz w:val="19"/>
-              </w:rPr>
+            <w:r>
               <w:t>60</w:t>
             </w:r>
           </w:p>
@@ -22591,17 +21331,7 @@
             <w:vAlign w:val="center"/>
           </w:tcPr>
           <w:p>
-            <w:pPr>
-              <w:jc w:val="center"/>
-            </w:pPr>
-            <w:r/>
-            <w:r>
-              <w:rPr>
-                <w:rFonts w:ascii="Calibri" w:hAnsi="Calibri"/>
-                <w:b/>
-                <w:color w:val="27AE60"/>
-                <w:sz w:val="19"/>
-              </w:rPr>
+            <w:r>
               <w:t>29</w:t>
             </w:r>
           </w:p>
@@ -22624,18 +21354,8 @@
             <w:vAlign w:val="center"/>
           </w:tcPr>
           <w:p>
-            <w:pPr>
-              <w:jc w:val="center"/>
-            </w:pPr>
-            <w:r/>
-            <w:r>
-              <w:rPr>
-                <w:rFonts w:ascii="Calibri" w:hAnsi="Calibri"/>
-                <w:b w:val="0"/>
-                <w:color w:val="333333"/>
-                <w:sz w:val="19"/>
-              </w:rPr>
-              <w:t>0</w:t>
+            <w:r>
+              <w:t>7</w:t>
             </w:r>
           </w:p>
         </w:tc>
@@ -22657,18 +21377,8 @@
             <w:vAlign w:val="center"/>
           </w:tcPr>
           <w:p>
-            <w:pPr>
-              <w:jc w:val="center"/>
-            </w:pPr>
-            <w:r/>
-            <w:r>
-              <w:rPr>
-                <w:rFonts w:ascii="Calibri" w:hAnsi="Calibri"/>
-                <w:b w:val="0"/>
-                <w:color w:val="333333"/>
-                <w:sz w:val="19"/>
-              </w:rPr>
-              <w:t>0</w:t>
+            <w:r>
+              <w:t>23</w:t>
             </w:r>
           </w:p>
         </w:tc>
@@ -22690,18 +21400,8 @@
             <w:vAlign w:val="center"/>
           </w:tcPr>
           <w:p>
-            <w:pPr>
-              <w:jc w:val="center"/>
-            </w:pPr>
-            <w:r/>
-            <w:r>
-              <w:rPr>
-                <w:rFonts w:ascii="Calibri" w:hAnsi="Calibri"/>
-                <w:b w:val="0"/>
-                <w:color w:val="333333"/>
-                <w:sz w:val="19"/>
-              </w:rPr>
-              <w:t>0</w:t>
+            <w:r>
+              <w:t>1</w:t>
             </w:r>
           </w:p>
         </w:tc>

</xml_diff>